<commit_message>
Regenerate report and presentation with student details
Co-Authored-By: Claude Opus 5.5 <noreply@anthropic.com>
</commit_message>
<xml_diff>
--- a/deliverables/VaaniSetu_MiniProject_Report.docx
+++ b/deliverables/VaaniSetu_MiniProject_Report.docx
@@ -400,7 +400,7 @@
           <w:szCs w:val="28"/>
           <w:u w:val="none"/>
         </w:rPr>
-        <w:t>Student Name1</w:t>
+        <w:t>Mohak Mandwani</w:t>
       </w:r>
       <w:r>
         <w:rPr>
@@ -433,125 +433,7 @@
           <w:szCs w:val="28"/>
           <w:u w:val="none"/>
         </w:rPr>
-        <w:t>App ID</w:t>
-      </w:r>
-    </w:p>
-    <w:p>
-      <w:pPr>
-        <w:pStyle w:val="Heading1"/>
-        <w:spacing w:line="360" w:lineRule="auto"/>
-        <w:jc w:val="center"/>
-        <w:rPr>
-          <w:b w:val="0"/>
-          <w:iCs/>
-          <w:color w:val="000000"/>
-          <w:sz w:val="28"/>
-          <w:szCs w:val="28"/>
-          <w:u w:val="none"/>
-        </w:rPr>
-      </w:pPr>
-      <w:r>
-        <w:rPr>
-          <w:b w:val="0"/>
-          <w:iCs/>
-          <w:color w:val="000000"/>
-          <w:sz w:val="28"/>
-          <w:szCs w:val="28"/>
-          <w:u w:val="none"/>
-        </w:rPr>
-        <w:t>Student Name2</w:t>
-      </w:r>
-      <w:r>
-        <w:rPr>
-          <w:b w:val="0"/>
-          <w:iCs/>
-          <w:color w:val="000000"/>
-          <w:sz w:val="28"/>
-          <w:szCs w:val="28"/>
-          <w:u w:val="none"/>
-        </w:rPr>
-        <w:tab/>
-      </w:r>
-      <w:r>
-        <w:rPr>
-          <w:b w:val="0"/>
-          <w:iCs/>
-          <w:color w:val="000000"/>
-          <w:sz w:val="28"/>
-          <w:szCs w:val="28"/>
-          <w:u w:val="none"/>
-        </w:rPr>
-        <w:tab/>
-      </w:r>
-      <w:r>
-        <w:rPr>
-          <w:b w:val="0"/>
-          <w:iCs/>
-          <w:color w:val="000000"/>
-          <w:sz w:val="28"/>
-          <w:szCs w:val="28"/>
-          <w:u w:val="none"/>
-        </w:rPr>
-        <w:t>App ID</w:t>
-      </w:r>
-    </w:p>
-    <w:p>
-      <w:pPr>
-        <w:pStyle w:val="Heading1"/>
-        <w:spacing w:line="360" w:lineRule="auto"/>
-        <w:jc w:val="center"/>
-        <w:rPr>
-          <w:b w:val="0"/>
-          <w:iCs/>
-          <w:color w:val="000000"/>
-          <w:sz w:val="28"/>
-          <w:szCs w:val="28"/>
-          <w:u w:val="none"/>
-        </w:rPr>
-      </w:pPr>
-      <w:r>
-        <w:rPr>
-          <w:b w:val="0"/>
-          <w:iCs/>
-          <w:color w:val="000000"/>
-          <w:sz w:val="28"/>
-          <w:szCs w:val="28"/>
-          <w:u w:val="none"/>
-        </w:rPr>
-        <w:t>Student Name3</w:t>
-      </w:r>
-      <w:r>
-        <w:rPr>
-          <w:b w:val="0"/>
-          <w:iCs/>
-          <w:color w:val="000000"/>
-          <w:sz w:val="28"/>
-          <w:szCs w:val="28"/>
-          <w:u w:val="none"/>
-        </w:rPr>
-        <w:tab/>
-      </w:r>
-      <w:r>
-        <w:rPr>
-          <w:b w:val="0"/>
-          <w:iCs/>
-          <w:color w:val="000000"/>
-          <w:sz w:val="28"/>
-          <w:szCs w:val="28"/>
-          <w:u w:val="none"/>
-        </w:rPr>
-        <w:tab/>
-      </w:r>
-      <w:r>
-        <w:rPr>
-          <w:b w:val="0"/>
-          <w:iCs/>
-          <w:color w:val="000000"/>
-          <w:sz w:val="28"/>
-          <w:szCs w:val="28"/>
-          <w:u w:val="none"/>
-        </w:rPr>
-        <w:t>App ID</w:t>
+        <w:t>2406506</w:t>
       </w:r>
     </w:p>
     <w:p>
@@ -931,7 +813,7 @@
           <w:szCs w:val="28"/>
           <w:u w:val="none"/>
         </w:rPr>
-        <w:t>Student Name1</w:t>
+        <w:t>Mohak Mandwani</w:t>
       </w:r>
       <w:r>
         <w:rPr>
@@ -961,115 +843,7 @@
           <w:szCs w:val="28"/>
           <w:u w:val="none"/>
         </w:rPr>
-        <w:t>App ID</w:t>
-      </w:r>
-    </w:p>
-    <w:p>
-      <w:pPr>
-        <w:pStyle w:val="Heading1"/>
-        <w:spacing w:line="360" w:lineRule="auto"/>
-        <w:jc w:val="center"/>
-        <w:rPr>
-          <w:iCs/>
-          <w:color w:val="000000"/>
-          <w:sz w:val="28"/>
-          <w:szCs w:val="28"/>
-          <w:u w:val="none"/>
-        </w:rPr>
-      </w:pPr>
-      <w:r>
-        <w:rPr>
-          <w:iCs/>
-          <w:color w:val="000000"/>
-          <w:sz w:val="28"/>
-          <w:szCs w:val="28"/>
-          <w:u w:val="none"/>
-        </w:rPr>
-        <w:t>Student Name2</w:t>
-      </w:r>
-      <w:r>
-        <w:rPr>
-          <w:iCs/>
-          <w:color w:val="000000"/>
-          <w:sz w:val="28"/>
-          <w:szCs w:val="28"/>
-          <w:u w:val="none"/>
-        </w:rPr>
-        <w:tab/>
-      </w:r>
-      <w:r>
-        <w:rPr>
-          <w:iCs/>
-          <w:color w:val="000000"/>
-          <w:sz w:val="28"/>
-          <w:szCs w:val="28"/>
-          <w:u w:val="none"/>
-        </w:rPr>
-        <w:tab/>
-      </w:r>
-      <w:r>
-        <w:rPr>
-          <w:iCs/>
-          <w:color w:val="000000"/>
-          <w:sz w:val="28"/>
-          <w:szCs w:val="28"/>
-          <w:u w:val="none"/>
-        </w:rPr>
-        <w:t>App ID</w:t>
-      </w:r>
-    </w:p>
-    <w:p>
-      <w:pPr>
-        <w:pStyle w:val="Heading1"/>
-        <w:spacing w:line="360" w:lineRule="auto"/>
-        <w:jc w:val="center"/>
-        <w:rPr>
-          <w:iCs/>
-          <w:color w:val="000000"/>
-          <w:sz w:val="28"/>
-          <w:szCs w:val="28"/>
-          <w:u w:val="none"/>
-        </w:rPr>
-      </w:pPr>
-      <w:r>
-        <w:rPr>
-          <w:iCs/>
-          <w:color w:val="000000"/>
-          <w:sz w:val="28"/>
-          <w:szCs w:val="28"/>
-          <w:u w:val="none"/>
-        </w:rPr>
-        <w:t>Student Name3</w:t>
-      </w:r>
-      <w:r>
-        <w:rPr>
-          <w:iCs/>
-          <w:color w:val="000000"/>
-          <w:sz w:val="28"/>
-          <w:szCs w:val="28"/>
-          <w:u w:val="none"/>
-        </w:rPr>
-        <w:tab/>
-      </w:r>
-      <w:r>
-        <w:rPr>
-          <w:iCs/>
-          <w:color w:val="000000"/>
-          <w:sz w:val="28"/>
-          <w:szCs w:val="28"/>
-          <w:u w:val="none"/>
-        </w:rPr>
-        <w:tab/>
-      </w:r>
-      <w:r>
-        <w:rPr>
-          <w:iCs/>
-          <w:color w:val="000000"/>
-          <w:sz w:val="28"/>
-          <w:szCs w:val="28"/>
-          <w:u w:val="none"/>
-        </w:rPr>
-        <w:t>App ID</w:t>
+        <w:t>2406506</w:t>
       </w:r>
     </w:p>
     <w:p>
@@ -1869,7 +1643,7 @@
           <w:noProof/>
         </w:rPr>
         <w:drawing>
-          <wp:inline distT="0" distB="0" distL="0" distR="0" wp14:anchorId="5CB04CD6" wp14:editId="7280A28D">
+          <wp:inline distT="0" distB="0" distL="0" distR="0" wp14:anchorId="25A3F424" wp14:editId="1DD9DFD9">
             <wp:extent cx="5400000" cy="3037500"/>
             <wp:effectExtent l="0" t="0" r="0" b="0"/>
             <wp:docPr id="1" name="Picture 1"/>
@@ -4980,7 +4754,7 @@
           <w:noProof/>
         </w:rPr>
         <w:drawing>
-          <wp:inline distT="0" distB="0" distL="0" distR="0" wp14:anchorId="4BE9023E" wp14:editId="4507EAA7">
+          <wp:inline distT="0" distB="0" distL="0" distR="0" wp14:anchorId="4A6D56BB" wp14:editId="5FA52809">
             <wp:extent cx="5400000" cy="2749091"/>
             <wp:effectExtent l="0" t="0" r="0" b="0"/>
             <wp:docPr id="2" name="Picture 2"/>
@@ -5040,7 +4814,7 @@
           <w:noProof/>
         </w:rPr>
         <w:drawing>
-          <wp:inline distT="0" distB="0" distL="0" distR="0" wp14:anchorId="5BC1D23F" wp14:editId="35ABA2F7">
+          <wp:inline distT="0" distB="0" distL="0" distR="0" wp14:anchorId="5DFDD4E2" wp14:editId="6DDCC65A">
             <wp:extent cx="5400000" cy="2749091"/>
             <wp:effectExtent l="0" t="0" r="0" b="0"/>
             <wp:docPr id="3" name="Picture 3"/>
@@ -5105,7 +4879,7 @@
           <w:noProof/>
         </w:rPr>
         <w:drawing>
-          <wp:inline distT="0" distB="0" distL="0" distR="0" wp14:anchorId="14979CAC" wp14:editId="17623C24">
+          <wp:inline distT="0" distB="0" distL="0" distR="0" wp14:anchorId="49B26C3F" wp14:editId="5CEF88F9">
             <wp:extent cx="5400000" cy="2749091"/>
             <wp:effectExtent l="0" t="0" r="0" b="0"/>
             <wp:docPr id="4" name="Picture 4"/>
@@ -5165,7 +4939,7 @@
           <w:noProof/>
         </w:rPr>
         <w:drawing>
-          <wp:inline distT="0" distB="0" distL="0" distR="0" wp14:anchorId="2EA9F9C3" wp14:editId="49DF68A9">
+          <wp:inline distT="0" distB="0" distL="0" distR="0" wp14:anchorId="6C669B5C" wp14:editId="37630FA2">
             <wp:extent cx="5400000" cy="2749091"/>
             <wp:effectExtent l="0" t="0" r="0" b="0"/>
             <wp:docPr id="5" name="Picture 5"/>
@@ -5230,7 +5004,7 @@
           <w:noProof/>
         </w:rPr>
         <w:drawing>
-          <wp:inline distT="0" distB="0" distL="0" distR="0" wp14:anchorId="1ABEE56D" wp14:editId="28744BC2">
+          <wp:inline distT="0" distB="0" distL="0" distR="0" wp14:anchorId="6E5B9363" wp14:editId="4A323F7D">
             <wp:extent cx="5400000" cy="2932977"/>
             <wp:effectExtent l="0" t="0" r="0" b="0"/>
             <wp:docPr id="6" name="Picture 6"/>
@@ -5290,7 +5064,7 @@
           <w:noProof/>
         </w:rPr>
         <w:drawing>
-          <wp:inline distT="0" distB="0" distL="0" distR="0" wp14:anchorId="108B1E0E" wp14:editId="440CCAFD">
+          <wp:inline distT="0" distB="0" distL="0" distR="0" wp14:anchorId="04BA8870" wp14:editId="0310E4FE">
             <wp:extent cx="5400000" cy="2745525"/>
             <wp:effectExtent l="0" t="0" r="0" b="0"/>
             <wp:docPr id="7" name="Picture 7"/>
@@ -5355,7 +5129,7 @@
           <w:noProof/>
         </w:rPr>
         <w:drawing>
-          <wp:inline distT="0" distB="0" distL="0" distR="0" wp14:anchorId="39D425D3" wp14:editId="1ABBE84C">
+          <wp:inline distT="0" distB="0" distL="0" distR="0" wp14:anchorId="3A2D8F82" wp14:editId="00E740A7">
             <wp:extent cx="5400000" cy="2749091"/>
             <wp:effectExtent l="0" t="0" r="0" b="0"/>
             <wp:docPr id="8" name="Picture 8"/>
@@ -5415,7 +5189,7 @@
           <w:noProof/>
         </w:rPr>
         <w:drawing>
-          <wp:inline distT="0" distB="0" distL="0" distR="0" wp14:anchorId="35CB5A84" wp14:editId="555C488D">
+          <wp:inline distT="0" distB="0" distL="0" distR="0" wp14:anchorId="42A809A7" wp14:editId="43873458">
             <wp:extent cx="5400000" cy="2745525"/>
             <wp:effectExtent l="0" t="0" r="0" b="0"/>
             <wp:docPr id="9" name="Picture 9"/>
@@ -5480,7 +5254,7 @@
           <w:noProof/>
         </w:rPr>
         <w:drawing>
-          <wp:inline distT="0" distB="0" distL="0" distR="0" wp14:anchorId="505837D1" wp14:editId="63622AA9">
+          <wp:inline distT="0" distB="0" distL="0" distR="0" wp14:anchorId="34EFEFC2" wp14:editId="73CDAC81">
             <wp:extent cx="5400000" cy="2749091"/>
             <wp:effectExtent l="0" t="0" r="0" b="0"/>
             <wp:docPr id="10" name="Picture 10"/>
@@ -5540,7 +5314,7 @@
           <w:noProof/>
         </w:rPr>
         <w:drawing>
-          <wp:inline distT="0" distB="0" distL="0" distR="0" wp14:anchorId="480B7826" wp14:editId="7B0D3313">
+          <wp:inline distT="0" distB="0" distL="0" distR="0" wp14:anchorId="345FD88F" wp14:editId="5C03BDFD">
             <wp:extent cx="5400000" cy="2745525"/>
             <wp:effectExtent l="0" t="0" r="0" b="0"/>
             <wp:docPr id="11" name="Picture 11"/>

</xml_diff>

<commit_message>
Regenerate report (DOCX, PDF) for Google Cloud
Co-Authored-By: Claude Opus 5.5 <noreply@anthropic.com>
</commit_message>
<xml_diff>
--- a/deliverables/VaaniSetu_MiniProject_Report.docx
+++ b/deliverables/VaaniSetu_MiniProject_Report.docx
@@ -159,7 +159,7 @@
           <w:szCs w:val="28"/>
           <w:u w:val="none"/>
         </w:rPr>
-        <w:t>“VaaniSetu: An AI-Powered Multilingual Document Reader using Amazon Bedrock, Amazon Polly, Amazon Rekognition and AWS Lambda”</w:t>
+        <w:t>“VaaniSetu: An AI-Powered Multilingual Document Reader using Vertex AI Gemini, Cloud Vision, Cloud Text-to-Speech and Cloud Run”</w:t>
       </w:r>
     </w:p>
     <w:p>
@@ -774,7 +774,7 @@
           <w:sz w:val="28"/>
           <w:szCs w:val="28"/>
         </w:rPr>
-        <w:t>VaaniSetu: An AI-Powered Multilingual Document Reader using Amazon Bedrock, Amazon Polly, Amazon Rekognition and AWS Lambda</w:t>
+        <w:t>VaaniSetu: An AI-Powered Multilingual Document Reader using Vertex AI Gemini, Cloud Vision, Cloud Text-to-Speech and Cloud Run</w:t>
       </w:r>
       <w:r>
         <w:rPr>
@@ -1431,7 +1431,7 @@
         <w:jc w:val="both"/>
       </w:pPr>
       <w:r>
-        <w:t>•  Build a fully serverless web application on AWS that needs no servers to manage.</w:t>
+        <w:t>•  Build a fully serverless web application on Google Cloud Platform (GCP) that needs no servers to manage.</w:t>
       </w:r>
     </w:p>
     <w:p>
@@ -1447,10 +1447,10 @@
         <w:rPr>
           <w:b/>
         </w:rPr>
-        <w:t>eight core AWS services</w:t>
-      </w:r>
-      <w:r>
-        <w:t xml:space="preserve"> (S3, Lambda, API Gateway, Rekognition, Bedrock, Polly, DynamoDB, Amplify) plus IAM and CloudWatch.</w:t>
+        <w:t>eight core Google Cloud services</w:t>
+      </w:r>
+      <w:r>
+        <w:t xml:space="preserve"> (Cloud Storage, Cloud Run functions, API Gateway, Cloud Vision, Vertex AI, Cloud Text-to-Speech, Firestore and Cloud Storage website hosting) plus IAM and Cloud Logging.</w:t>
       </w:r>
     </w:p>
     <w:p>
@@ -1460,7 +1460,7 @@
         <w:jc w:val="both"/>
       </w:pPr>
       <w:r>
-        <w:t>•  Use generative AI (Amazon Nova on Amazon Bedrock) to read and explain documents in seven languages, and neural text-to-speech (Amazon Polly) to speak the explanation.</w:t>
+        <w:t>•  Use generative AI (Gemini on Vertex AI) to read and explain documents in seven languages, and neural text-to-speech (Cloud Text-to-Speech) to speak the explanation.</w:t>
       </w:r>
     </w:p>
     <w:p>
@@ -1470,7 +1470,7 @@
         <w:jc w:val="both"/>
       </w:pPr>
       <w:r>
-        <w:t>•  Keep the system secure (private storage, pre-signed URLs, least-privilege IAM) and cost-efficient (pay-per-use, no idle cost).</w:t>
+        <w:t>•  Keep the system secure (private storage, signed URLs, least-privilege service accounts) and cost-efficient (pay-per-use, scale to zero, no idle cost).</w:t>
       </w:r>
     </w:p>
     <w:p>
@@ -1500,7 +1500,7 @@
         <w:rPr>
           <w:b/>
         </w:rPr>
-        <w:t>Photo to speech in about 10 seconds</w:t>
+        <w:t>Photo to speech in about 11 seconds</w:t>
       </w:r>
       <w:r>
         <w:t>: upload or capture a document photo and hear it explained.</w:t>
@@ -1522,7 +1522,7 @@
         <w:t>Seven output languages</w:t>
       </w:r>
       <w:r>
-        <w:t>: English, Hindi, Spanish, French, German, Japanese and Arabic, each with a natural Amazon Polly neural voice. The source document can be in any language (for example, a Hindi bill explained in English).</w:t>
+        <w:t>: English, Hindi, Spanish, French, German, Japanese and Arabic, each with a natural neural voice. The source document can be in any language (for example, a Hindi bill explained in English).</w:t>
       </w:r>
     </w:p>
     <w:p>
@@ -1560,7 +1560,7 @@
         <w:t>Smart gatekeeping</w:t>
       </w:r>
       <w:r>
-        <w:t>: Amazon Rekognition checks that the photo really contains text before the more expensive AI model is called.</w:t>
+        <w:t>: Cloud Vision checks that the photo really contains text before the Gemini model is called.</w:t>
       </w:r>
     </w:p>
     <w:p>
@@ -1579,7 +1579,7 @@
         <w:t>History</w:t>
       </w:r>
       <w:r>
-        <w:t>: every processed document is stored in DynamoDB and can be replayed.</w:t>
+        <w:t>: every processed document is stored in Firestore and can be replayed.</w:t>
       </w:r>
     </w:p>
     <w:p>
@@ -1598,7 +1598,7 @@
         <w:t>Accessible design</w:t>
       </w:r>
       <w:r>
-        <w:t>: large type, high contrast, keyboard navigation and a live progress tracker that shows each AWS service as it runs.</w:t>
+        <w:t>: large type, high contrast, keyboard navigation and a live progress tracker that shows each Google Cloud service as it runs.</w:t>
       </w:r>
     </w:p>
     <w:p>
@@ -1629,7 +1629,7 @@
         <w:jc w:val="both"/>
       </w:pPr>
       <w:r>
-        <w:t>Figure 2.1 shows the architecture of VaaniSetu. All components run in the AWS Asia Pacific (Mumbai) region, ap-south-1.</w:t>
+        <w:t>Figure 2.1 shows the architecture of VaaniSetu. All components run in the Google Cloud Mumbai region (asia-south1), except API Gateway, which is not offered in Mumbai and runs in the nearest supported region, Tokyo (asia-northeast1).</w:t>
       </w:r>
     </w:p>
     <w:p>
@@ -1643,7 +1643,7 @@
           <w:noProof/>
         </w:rPr>
         <w:drawing>
-          <wp:inline distT="0" distB="0" distL="0" distR="0" wp14:anchorId="25A3F424" wp14:editId="1DD9DFD9">
+          <wp:inline distT="0" distB="0" distL="0" distR="0" wp14:anchorId="14D81917" wp14:editId="41474B51">
             <wp:extent cx="5400000" cy="3037500"/>
             <wp:effectExtent l="0" t="0" r="0" b="0"/>
             <wp:docPr id="1" name="Picture 1"/>
@@ -1689,7 +1689,7 @@
           <w:i/>
           <w:sz w:val="21"/>
         </w:rPr>
-        <w:t>Figure 2.1: System block diagram of VaaniSetu on AWS</w:t>
+        <w:t>Figure 2.1: System block diagram of VaaniSetu on Google Cloud</w:t>
       </w:r>
     </w:p>
     <w:p>
@@ -1713,13 +1713,13 @@
         <w:jc w:val="both"/>
       </w:pPr>
       <w:r>
-        <w:t xml:space="preserve">1.  The user opens the web application, which is served over HTTPS by </w:t>
+        <w:t xml:space="preserve">1.  The user opens the web application, a static website served over HTTPS from </w:t>
       </w:r>
       <w:r>
         <w:rPr>
           <w:b/>
         </w:rPr>
-        <w:t>AWS Amplify Hosting</w:t>
+        <w:t>Cloud Storage</w:t>
       </w:r>
       <w:r>
         <w:t>.</w:t>
@@ -1747,19 +1747,19 @@
         <w:rPr>
           <w:b/>
         </w:rPr>
-        <w:t>Amazon API Gateway</w:t>
-      </w:r>
-      <w:r>
-        <w:t xml:space="preserve">. </w:t>
+        <w:t>Google Cloud API Gateway</w:t>
+      </w:r>
+      <w:r>
+        <w:t xml:space="preserve">. The </w:t>
       </w:r>
       <w:r>
         <w:rPr>
           <w:b/>
         </w:rPr>
-        <w:t>AWS Lambda</w:t>
-      </w:r>
-      <w:r>
-        <w:t xml:space="preserve"> returns a short-lived pre-signed URL.</w:t>
+        <w:t>Cloud Run function</w:t>
+      </w:r>
+      <w:r>
+        <w:t xml:space="preserve"> returns a short-lived V4 signed URL.</w:t>
       </w:r>
     </w:p>
     <w:p>
@@ -1775,7 +1775,7 @@
         <w:rPr>
           <w:b/>
         </w:rPr>
-        <w:t>directly to a private Amazon S3 bucket</w:t>
+        <w:t>directly to a private Cloud Storage bucket</w:t>
       </w:r>
       <w:r>
         <w:t xml:space="preserve"> using that URL, so large files never pass through the API.</w:t>
@@ -1797,16 +1797,16 @@
         <w:t>POST /process</w:t>
       </w:r>
       <w:r>
-        <w:t xml:space="preserve">. Lambda asks </w:t>
+        <w:t xml:space="preserve">. The function asks </w:t>
       </w:r>
       <w:r>
         <w:rPr>
           <w:b/>
         </w:rPr>
-        <w:t>Amazon Rekognition</w:t>
-      </w:r>
-      <w:r>
-        <w:t xml:space="preserve"> (DetectText) whether the image contains readable text. Photos without text are rejected at this point.</w:t>
+        <w:t>Cloud Vision</w:t>
+      </w:r>
+      <w:r>
+        <w:t xml:space="preserve"> (text detection) whether the image contains readable text. Photos without text are rejected at this point.</w:t>
       </w:r>
     </w:p>
     <w:p>
@@ -1816,13 +1816,13 @@
         <w:jc w:val="both"/>
       </w:pPr>
       <w:r>
-        <w:t xml:space="preserve">5.  Lambda sends the image to </w:t>
+        <w:t xml:space="preserve">5.  The function sends the image to </w:t>
       </w:r>
       <w:r>
         <w:rPr>
           <w:b/>
         </w:rPr>
-        <w:t>Amazon Nova 2 Lite on Amazon Bedrock</w:t>
+        <w:t>Gemini 3.5 Flash-Lite on Vertex AI</w:t>
       </w:r>
       <w:r>
         <w:t>, which transcribes the document and returns JSON: document type, title, a spoken summary in the chosen language, key points and action items.</w:t>
@@ -1841,10 +1841,10 @@
         <w:rPr>
           <w:b/>
         </w:rPr>
-        <w:t>Amazon Polly</w:t>
-      </w:r>
-      <w:r>
-        <w:t xml:space="preserve"> converts the summary to speech with a neural voice. The MP3 file is saved to S3.</w:t>
+        <w:t>Cloud Text-to-Speech</w:t>
+      </w:r>
+      <w:r>
+        <w:t xml:space="preserve"> converts the summary to speech with a neural voice. The MP3 file is saved to Cloud Storage.</w:t>
       </w:r>
     </w:p>
     <w:p>
@@ -1860,10 +1860,10 @@
         <w:rPr>
           <w:b/>
         </w:rPr>
-        <w:t>Amazon DynamoDB</w:t>
-      </w:r>
-      <w:r>
-        <w:t xml:space="preserve"> and returned to the browser with pre-signed links to the image and audio, and the audio plays automatically.</w:t>
+        <w:t>Firestore</w:t>
+      </w:r>
+      <w:r>
+        <w:t xml:space="preserve"> and returned to the browser with signed links to the image and audio, and the audio plays automatically.</w:t>
       </w:r>
     </w:p>
     <w:p>
@@ -1879,19 +1879,19 @@
         <w:rPr>
           <w:b/>
         </w:rPr>
-        <w:t>AWS IAM</w:t>
-      </w:r>
-      <w:r>
-        <w:t xml:space="preserve"> limits the Lambda function to exactly these actions, and </w:t>
+        <w:t>IAM service accounts</w:t>
+      </w:r>
+      <w:r>
+        <w:t xml:space="preserve"> limit each component to exactly the roles it needs, and </w:t>
       </w:r>
       <w:r>
         <w:rPr>
           <w:b/>
         </w:rPr>
-        <w:t>Amazon CloudWatch</w:t>
-      </w:r>
-      <w:r>
-        <w:t xml:space="preserve"> records logs and metrics for every request.</w:t>
+        <w:t>Cloud Logging</w:t>
+      </w:r>
+      <w:r>
+        <w:t xml:space="preserve"> records every request.</w:t>
       </w:r>
     </w:p>
     <w:p>
@@ -2005,7 +2005,7 @@
               <w:rPr>
                 <w:sz w:val="21"/>
               </w:rPr>
-              <w:t>Backend business logic running on AWS Lambda (arm64 / Graviton).</w:t>
+              <w:t>Backend business logic running as a Cloud Run function (gen2).</w:t>
             </w:r>
           </w:p>
         </w:tc>
@@ -2024,7 +2024,7 @@
               <w:rPr>
                 <w:sz w:val="21"/>
               </w:rPr>
-              <w:t>Boto3 (AWS SDK for Python)</w:t>
+              <w:t>Google Cloud client libraries</w:t>
             </w:r>
           </w:p>
         </w:tc>
@@ -2038,7 +2038,7 @@
               <w:rPr>
                 <w:sz w:val="21"/>
               </w:rPr>
-              <w:t>Calls S3, Rekognition, Bedrock (Converse API), Polly and DynamoDB from Lambda.</w:t>
+              <w:t>google-cloud-storage, -vision, -texttospeech and -firestore, plus google-genai for Gemini on Vertex AI.</w:t>
             </w:r>
           </w:p>
         </w:tc>
@@ -2056,7 +2056,7 @@
               <w:rPr>
                 <w:sz w:val="21"/>
               </w:rPr>
-              <w:t>HTML5</w:t>
+              <w:t>Functions Framework</w:t>
             </w:r>
           </w:p>
         </w:tc>
@@ -2069,7 +2069,7 @@
               <w:rPr>
                 <w:sz w:val="21"/>
               </w:rPr>
-              <w:t>Page structure: upload area, language selector, results, history and "how it works" sections, with semantic, accessible markup.</w:t>
+              <w:t>Exposes the Python handler as an HTTP endpoint on Cloud Run.</w:t>
             </w:r>
           </w:p>
         </w:tc>
@@ -2088,7 +2088,7 @@
               <w:rPr>
                 <w:sz w:val="21"/>
               </w:rPr>
-              <w:t>CSS3</w:t>
+              <w:t>HTML5</w:t>
             </w:r>
           </w:p>
         </w:tc>
@@ -2102,7 +2102,7 @@
               <w:rPr>
                 <w:sz w:val="21"/>
               </w:rPr>
-              <w:t>Styling: responsive grid layout, custom design tokens, animated pipeline tracker and waveform, mobile layout and reduced-motion support.</w:t>
+              <w:t>Page structure: upload area, language selector, results, history and "how it works" sections, with semantic, accessible markup.</w:t>
             </w:r>
           </w:p>
         </w:tc>
@@ -2120,7 +2120,7 @@
               <w:rPr>
                 <w:sz w:val="21"/>
               </w:rPr>
-              <w:t>JavaScript (ES2020)</w:t>
+              <w:t>CSS3</w:t>
             </w:r>
           </w:p>
         </w:tc>
@@ -2133,7 +2133,7 @@
               <w:rPr>
                 <w:sz w:val="21"/>
               </w:rPr>
-              <w:t>Dynamic features: drag-and-drop and camera upload, in-browser image resizing (Canvas API), Fetch API calls, live pipeline status, audio playback and history cards.</w:t>
+              <w:t>Styling: responsive grid layout, custom design tokens, animated pipeline tracker and waveform, mobile layout and reduced-motion support.</w:t>
             </w:r>
           </w:p>
         </w:tc>
@@ -2152,7 +2152,7 @@
               <w:rPr>
                 <w:sz w:val="21"/>
               </w:rPr>
-              <w:t>JSON</w:t>
+              <w:t>JavaScript (ES2020)</w:t>
             </w:r>
           </w:p>
         </w:tc>
@@ -2166,7 +2166,7 @@
               <w:rPr>
                 <w:sz w:val="21"/>
               </w:rPr>
-              <w:t>Data format between browser, API and AI model, and for IAM policies.</w:t>
+              <w:t>Dynamic features: drag-and-drop and camera upload, in-browser image resizing (Canvas API), Fetch API calls, live pipeline status, audio playback and history cards.</w:t>
             </w:r>
           </w:p>
         </w:tc>
@@ -2184,7 +2184,7 @@
               <w:rPr>
                 <w:sz w:val="21"/>
               </w:rPr>
-              <w:t>AWS CLI and Bash</w:t>
+              <w:t>JSON and OpenAPI 2.0</w:t>
             </w:r>
           </w:p>
         </w:tc>
@@ -2197,7 +2197,7 @@
               <w:rPr>
                 <w:sz w:val="21"/>
               </w:rPr>
-              <w:t>Infrastructure provisioning and repeatable deployment (infra/deploy.sh).</w:t>
+              <w:t>Data format between browser, API and AI model; API Gateway configuration.</w:t>
             </w:r>
           </w:p>
         </w:tc>
@@ -2216,7 +2216,7 @@
               <w:rPr>
                 <w:sz w:val="21"/>
               </w:rPr>
-              <w:t>Git and GitHub</w:t>
+              <w:t>gcloud CLI and Bash</w:t>
             </w:r>
           </w:p>
         </w:tc>
@@ -2230,6 +2230,37 @@
               <w:rPr>
                 <w:sz w:val="21"/>
               </w:rPr>
+              <w:t>Repeatable provisioning and deployment from Cloud Shell (infra/deploy.sh).</w:t>
+            </w:r>
+          </w:p>
+        </w:tc>
+      </w:tr>
+      <w:tr>
+        <w:trPr>
+          <w:jc w:val="center"/>
+        </w:trPr>
+        <w:tc>
+          <w:tcPr>
+            <w:tcW w:w="2551" w:type="dxa"/>
+          </w:tcPr>
+          <w:p>
+            <w:r>
+              <w:rPr>
+                <w:sz w:val="21"/>
+              </w:rPr>
+              <w:t>Git and GitHub</w:t>
+            </w:r>
+          </w:p>
+        </w:tc>
+        <w:tc>
+          <w:tcPr>
+            <w:tcW w:w="5953" w:type="dxa"/>
+          </w:tcPr>
+          <w:p>
+            <w:r>
+              <w:rPr>
+                <w:sz w:val="21"/>
+              </w:rPr>
               <w:t>Version control with small, atomic commits.</w:t>
             </w:r>
           </w:p>
@@ -2261,7 +2292,7 @@
         <w:jc w:val="both"/>
       </w:pPr>
       <w:r>
-        <w:t>The following AWS services are used. All of them are serverless or fully managed, so the application has no servers to patch and costs nothing while idle.</w:t>
+        <w:t>The following Google Cloud services are used. All of them are serverless or fully managed, so the application has no servers to patch and costs nothing while idle.</w:t>
       </w:r>
     </w:p>
     <w:tbl>
@@ -2293,7 +2324,7 @@
                 <w:color w:val="FFFFFF"/>
                 <w:sz w:val="20"/>
               </w:rPr>
-              <w:t>AWS Service</w:t>
+              <w:t>Google Cloud Service</w:t>
             </w:r>
           </w:p>
         </w:tc>
@@ -2343,7 +2374,7 @@
               <w:rPr>
                 <w:sz w:val="20"/>
               </w:rPr>
-              <w:t>Amazon S3</w:t>
+              <w:t>Cloud Storage</w:t>
             </w:r>
           </w:p>
         </w:tc>
@@ -2369,7 +2400,7 @@
               <w:rPr>
                 <w:sz w:val="20"/>
               </w:rPr>
-              <w:t>Private bucket, public access blocked, SSE-S3 encryption, CORS for browser upload, 30-day lifecycle on uploads, pre-signed URLs.</w:t>
+              <w:t>Private bucket in asia-south1, public access prevention enforced, uniform access, CORS for browser upload, uploads deleted after 30 days, V4 signed URLs.</w:t>
             </w:r>
           </w:p>
         </w:tc>
@@ -2388,7 +2419,7 @@
               <w:rPr>
                 <w:sz w:val="20"/>
               </w:rPr>
-              <w:t>AWS Lambda</w:t>
+              <w:t>Cloud Run functions</w:t>
             </w:r>
           </w:p>
         </w:tc>
@@ -2416,7 +2447,7 @@
               <w:rPr>
                 <w:sz w:val="20"/>
               </w:rPr>
-              <w:t>vaanisetu-api, Python 3.12, arm64, 512 MB, 29 s timeout.</w:t>
+              <w:t>vaanisetu-api (gen2), Python 3.12, 512 MB, 60 s timeout, 0 to 3 instances.</w:t>
             </w:r>
           </w:p>
         </w:tc>
@@ -2434,7 +2465,7 @@
               <w:rPr>
                 <w:sz w:val="20"/>
               </w:rPr>
-              <w:t>Amazon API Gateway</w:t>
+              <w:t>API Gateway</w:t>
             </w:r>
           </w:p>
         </w:tc>
@@ -2447,7 +2478,7 @@
               <w:rPr>
                 <w:sz w:val="20"/>
               </w:rPr>
-              <w:t>Public REST entry point for the web app.</w:t>
+              <w:t>Public HTTPS entry point for the web app.</w:t>
             </w:r>
           </w:p>
         </w:tc>
@@ -2460,7 +2491,7 @@
               <w:rPr>
                 <w:sz w:val="20"/>
               </w:rPr>
-              <w:t>HTTP API with routes POST /upload-url, POST /process, GET /history; CORS; throttling at 10 req/s (burst 20).</w:t>
+              <w:t>OpenAPI config with POST /upload-url, POST /process, GET /history and CORS; gateway in asia-northeast1; calls the private function with its own service account.</w:t>
             </w:r>
           </w:p>
         </w:tc>
@@ -2479,7 +2510,7 @@
               <w:rPr>
                 <w:sz w:val="20"/>
               </w:rPr>
-              <w:t>Amazon Bedrock</w:t>
+              <w:t>Vertex AI (Gemini)</w:t>
             </w:r>
           </w:p>
         </w:tc>
@@ -2507,7 +2538,7 @@
               <w:rPr>
                 <w:sz w:val="20"/>
               </w:rPr>
-              <w:t>Model: Amazon Nova 2 Lite (multimodal) via the global cross-region inference profile, Converse API, temperature 0.2.</w:t>
+              <w:t>Gemini 3.5 Flash-Lite (multimodal), global endpoint, JSON output, temperature 0.2, thinking off.</w:t>
             </w:r>
           </w:p>
         </w:tc>
@@ -2525,7 +2556,7 @@
               <w:rPr>
                 <w:sz w:val="20"/>
               </w:rPr>
-              <w:t>Amazon Rekognition</w:t>
+              <w:t>Cloud Vision API</w:t>
             </w:r>
           </w:p>
         </w:tc>
@@ -2538,7 +2569,7 @@
               <w:rPr>
                 <w:sz w:val="20"/>
               </w:rPr>
-              <w:t>Computer-vision gate: detects printed text before calling the AI model.</w:t>
+              <w:t>Computer-vision gate: detects printed text before calling Gemini.</w:t>
             </w:r>
           </w:p>
         </w:tc>
@@ -2551,7 +2582,7 @@
               <w:rPr>
                 <w:sz w:val="20"/>
               </w:rPr>
-              <w:t>DetectText API reading the image directly from S3; at least 2 text lines required.</w:t>
+              <w:t>Document text detection reading the image directly from Cloud Storage; at least 2 lines required.</w:t>
             </w:r>
           </w:p>
         </w:tc>
@@ -2570,7 +2601,7 @@
               <w:rPr>
                 <w:sz w:val="20"/>
               </w:rPr>
-              <w:t>Amazon Polly</w:t>
+              <w:t>Cloud Text-to-Speech</w:t>
             </w:r>
           </w:p>
         </w:tc>
@@ -2598,7 +2629,7 @@
               <w:rPr>
                 <w:sz w:val="20"/>
               </w:rPr>
-              <w:t>Neural engine; voices Kajal (English-IN and Hindi), Lucia, Lea, Vicki, Kazuha and Hala; MP3 output.</w:t>
+              <w:t>Neural2 / WaveNet voices for en-IN, hi-IN, es-ES, fr-FR, de-DE, ja-JP and ar-XA; MP3 output.</w:t>
             </w:r>
           </w:p>
         </w:tc>
@@ -2616,7 +2647,7 @@
               <w:rPr>
                 <w:sz w:val="20"/>
               </w:rPr>
-              <w:t>Amazon DynamoDB</w:t>
+              <w:t>Firestore</w:t>
             </w:r>
           </w:p>
         </w:tc>
@@ -2642,7 +2673,7 @@
               <w:rPr>
                 <w:sz w:val="20"/>
               </w:rPr>
-              <w:t>Table vaanisetu-documents, on-demand capacity, key pk + createdAt for newest-first queries.</w:t>
+              <w:t>Native mode, asia-south1, free tier; collection documents ordered by createdAt.</w:t>
             </w:r>
           </w:p>
         </w:tc>
@@ -2661,7 +2692,7 @@
               <w:rPr>
                 <w:sz w:val="20"/>
               </w:rPr>
-              <w:t>AWS Amplify Hosting</w:t>
+              <w:t>Cloud Storage website</w:t>
             </w:r>
           </w:p>
         </w:tc>
@@ -2675,7 +2706,7 @@
               <w:rPr>
                 <w:sz w:val="20"/>
               </w:rPr>
-              <w:t>Hosts the static frontend over HTTPS with a global CDN.</w:t>
+              <w:t>Hosts the static frontend over HTTPS.</w:t>
             </w:r>
           </w:p>
         </w:tc>
@@ -2689,7 +2720,7 @@
               <w:rPr>
                 <w:sz w:val="20"/>
               </w:rPr>
-              <w:t>App vaanisetu, branch main, deployed from a zip by the deploy script.</w:t>
+              <w:t>Separate public-read bucket vaanisetu-web-&lt;project&gt; with index.html as main page.</w:t>
             </w:r>
           </w:p>
         </w:tc>
@@ -2707,7 +2738,7 @@
               <w:rPr>
                 <w:sz w:val="20"/>
               </w:rPr>
-              <w:t>AWS IAM</w:t>
+              <w:t>IAM</w:t>
             </w:r>
           </w:p>
         </w:tc>
@@ -2720,7 +2751,7 @@
               <w:rPr>
                 <w:sz w:val="20"/>
               </w:rPr>
-              <w:t>Security: grants Lambda only the permissions it needs.</w:t>
+              <w:t>Security: grants each component only the permissions it needs.</w:t>
             </w:r>
           </w:p>
         </w:tc>
@@ -2733,7 +2764,7 @@
               <w:rPr>
                 <w:sz w:val="20"/>
               </w:rPr>
-              <w:t>Role vaanisetu-lambda-role with a least-privilege inline policy (see Section 4.4).</w:t>
+              <w:t>Service accounts vaanisetu-fn, vaanisetu-gateway and vaanisetu-build with least-privilege roles.</w:t>
             </w:r>
           </w:p>
         </w:tc>
@@ -2752,7 +2783,7 @@
               <w:rPr>
                 <w:sz w:val="20"/>
               </w:rPr>
-              <w:t>Amazon CloudWatch</w:t>
+              <w:t>Cloud Logging</w:t>
             </w:r>
           </w:p>
         </w:tc>
@@ -2766,7 +2797,7 @@
               <w:rPr>
                 <w:sz w:val="20"/>
               </w:rPr>
-              <w:t>Monitoring: Lambda logs, errors and duration metrics.</w:t>
+              <w:t>Monitoring: request logs, errors and latency.</w:t>
             </w:r>
           </w:p>
         </w:tc>
@@ -2780,7 +2811,7 @@
               <w:rPr>
                 <w:sz w:val="20"/>
               </w:rPr>
-              <w:t>Log group /aws/lambda/vaanisetu-api.</w:t>
+              <w:t>Function logs and metrics; budget alert of 400 INR at 50%, 90% and 100%.</w:t>
             </w:r>
           </w:p>
         </w:tc>
@@ -2788,17 +2819,8 @@
     </w:tbl>
     <w:p>
       <w:pPr>
-        <w:spacing w:after="40"/>
-      </w:pPr>
-    </w:p>
-    <w:p>
-      <w:r>
-        <w:br w:type="page"/>
-      </w:r>
-    </w:p>
-    <w:p>
-      <w:pPr>
         <w:keepNext/>
+        <w:pageBreakBefore/>
         <w:pBdr>
           <w:bottom w:val="single" w:sz="8" w:space="4" w:color="1F3864"/>
         </w:pBdr>
@@ -2810,6 +2832,7 @@
           <w:color w:val="1F3864"/>
           <w:sz w:val="32"/>
         </w:rPr>
+        <w:lastRenderedPageBreak/>
         <w:t>4.  Code</w:t>
       </w:r>
     </w:p>
@@ -2819,7 +2842,7 @@
         <w:jc w:val="both"/>
       </w:pPr>
       <w:r>
-        <w:t>The complete source code is in the project repository (https://github.com/17mohak/vaanisetu). It is organised into backend/ (Lambda), frontend/ (web app), infra/ (deployment script, IAM policy, sample generator) and report/. The most important parts are shown below.</w:t>
+        <w:t>The complete source code is in the project repository (https://github.com/17mohak/vaanisetu). It is organised into backend/ (Cloud Run function), frontend/ (web app), infra/ (deployment script, API Gateway config, sample generator) and report/. The most important parts are shown below.</w:t>
       </w:r>
     </w:p>
     <w:p>
@@ -2833,7 +2856,7 @@
           <w:color w:val="1F3864"/>
           <w:sz w:val="26"/>
         </w:rPr>
-        <w:t>4.1  Lambda: request routing</w:t>
+        <w:t>4.1  Cloud Run function: request routing</w:t>
       </w:r>
     </w:p>
     <w:p>
@@ -2846,7 +2869,7 @@
           <w:b/>
           <w:sz w:val="22"/>
         </w:rPr>
-        <w:t>backend/lambda_function.py: lambda_handler</w:t>
+        <w:t>backend/main.py: api</w:t>
       </w:r>
     </w:p>
     <w:tbl>
@@ -2870,43 +2893,43 @@
                 <w:rFonts w:ascii="Consolas" w:hAnsi="Consolas"/>
                 <w:sz w:val="17"/>
               </w:rPr>
-              <w:t>def lambda_handler(event, context):</w:t>
-            </w:r>
-          </w:p>
-          <w:p>
-            <w:r>
-              <w:rPr>
-                <w:rFonts w:ascii="Consolas" w:hAnsi="Consolas"/>
-                <w:sz w:val="17"/>
-              </w:rPr>
-              <w:t xml:space="preserve">    method = event.get("requestContext", {}).get("http", {}).get("method", "GET")</w:t>
-            </w:r>
-          </w:p>
-          <w:p>
-            <w:r>
-              <w:rPr>
-                <w:rFonts w:ascii="Consolas" w:hAnsi="Consolas"/>
-                <w:sz w:val="17"/>
-              </w:rPr>
-              <w:t xml:space="preserve">    path = event.get("rawPath", "/")</w:t>
-            </w:r>
-          </w:p>
-          <w:p>
-            <w:r>
-              <w:rPr>
-                <w:rFonts w:ascii="Consolas" w:hAnsi="Consolas"/>
-                <w:sz w:val="17"/>
-              </w:rPr>
-              <w:t xml:space="preserve">    if method == "OPTIONS":</w:t>
-            </w:r>
-          </w:p>
-          <w:p>
-            <w:r>
-              <w:rPr>
-                <w:rFonts w:ascii="Consolas" w:hAnsi="Consolas"/>
-                <w:sz w:val="17"/>
-              </w:rPr>
-              <w:t xml:space="preserve">        return respond(200, {})</w:t>
+              <w:t>@functions_framework.http</w:t>
+            </w:r>
+          </w:p>
+          <w:p>
+            <w:r>
+              <w:rPr>
+                <w:rFonts w:ascii="Consolas" w:hAnsi="Consolas"/>
+                <w:sz w:val="17"/>
+              </w:rPr>
+              <w:t>def api(request):</w:t>
+            </w:r>
+          </w:p>
+          <w:p>
+            <w:r>
+              <w:rPr>
+                <w:rFonts w:ascii="Consolas" w:hAnsi="Consolas"/>
+                <w:sz w:val="17"/>
+              </w:rPr>
+              <w:t xml:space="preserve">    if request.method == "OPTIONS":</w:t>
+            </w:r>
+          </w:p>
+          <w:p>
+            <w:r>
+              <w:rPr>
+                <w:rFonts w:ascii="Consolas" w:hAnsi="Consolas"/>
+                <w:sz w:val="17"/>
+              </w:rPr>
+              <w:t xml:space="preserve">        return ("", 204, CORS)</w:t>
+            </w:r>
+          </w:p>
+          <w:p>
+            <w:r>
+              <w:rPr>
+                <w:rFonts w:ascii="Consolas" w:hAnsi="Consolas"/>
+                <w:sz w:val="17"/>
+              </w:rPr>
+              <w:t xml:space="preserve">    path = request.path</w:t>
             </w:r>
           </w:p>
           <w:p>
@@ -2924,16 +2947,16 @@
                 <w:rFonts w:ascii="Consolas" w:hAnsi="Consolas"/>
                 <w:sz w:val="17"/>
               </w:rPr>
-              <w:t xml:space="preserve">        body = json.loads(event.get("body") or "{}") if method == "POST" else {}</w:t>
-            </w:r>
-          </w:p>
-          <w:p>
-            <w:r>
-              <w:rPr>
-                <w:rFonts w:ascii="Consolas" w:hAnsi="Consolas"/>
-                <w:sz w:val="17"/>
-              </w:rPr>
-              <w:t xml:space="preserve">        if path.endswith("/upload-url") and method == "POST":</w:t>
+              <w:t xml:space="preserve">        body = (request.get_json(silent=True) or {}) if request.method == "POST" else {}</w:t>
+            </w:r>
+          </w:p>
+          <w:p>
+            <w:r>
+              <w:rPr>
+                <w:rFonts w:ascii="Consolas" w:hAnsi="Consolas"/>
+                <w:sz w:val="17"/>
+              </w:rPr>
+              <w:t xml:space="preserve">        if path.endswith("/upload-url") and request.method == "POST":</w:t>
             </w:r>
           </w:p>
           <w:p>
@@ -2951,7 +2974,7 @@
                 <w:rFonts w:ascii="Consolas" w:hAnsi="Consolas"/>
                 <w:sz w:val="17"/>
               </w:rPr>
-              <w:t xml:space="preserve">        if path.endswith("/process") and method == "POST":</w:t>
+              <w:t xml:space="preserve">        if path.endswith("/process") and request.method == "POST":</w:t>
             </w:r>
           </w:p>
           <w:p>
@@ -2969,7 +2992,7 @@
                 <w:rFonts w:ascii="Consolas" w:hAnsi="Consolas"/>
                 <w:sz w:val="17"/>
               </w:rPr>
-              <w:t xml:space="preserve">        if path.endswith("/history") and method == "GET":</w:t>
+              <w:t xml:space="preserve">        if path.endswith("/history") and request.method == "GET":</w:t>
             </w:r>
           </w:p>
           <w:p>
@@ -3014,7 +3037,7 @@
                 <w:rFonts w:ascii="Consolas" w:hAnsi="Consolas"/>
                 <w:sz w:val="17"/>
               </w:rPr>
-              <w:t xml:space="preserve">    except Exception as e:  # logged to CloudWatch</w:t>
+              <w:t xml:space="preserve">    except Exception as e:  # logged to Cloud Logging</w:t>
             </w:r>
           </w:p>
           <w:p>
@@ -3054,7 +3077,7 @@
           <w:color w:val="1F3864"/>
           <w:sz w:val="26"/>
         </w:rPr>
-        <w:t>4.2  Lambda: AI pipeline (Rekognition → Bedrock → Polly → DynamoDB)</w:t>
+        <w:t>4.2  AI pipeline (Vision → Gemini → Text-to-Speech → Firestore)</w:t>
       </w:r>
     </w:p>
     <w:p>
@@ -3067,7 +3090,7 @@
           <w:b/>
           <w:sz w:val="22"/>
         </w:rPr>
-        <w:t>backend/lambda_function.py: process_document</w:t>
+        <w:t>backend/main.py: process_document</w:t>
       </w:r>
     </w:p>
     <w:tbl>
@@ -3181,16 +3204,16 @@
                 <w:rFonts w:ascii="Consolas" w:hAnsi="Consolas"/>
                 <w:sz w:val="17"/>
               </w:rPr>
-              <w:t xml:space="preserve">    obj = s3.get_object(Bucket=BUCKET, Key=key)</w:t>
-            </w:r>
-          </w:p>
-          <w:p>
-            <w:r>
-              <w:rPr>
-                <w:rFonts w:ascii="Consolas" w:hAnsi="Consolas"/>
-                <w:sz w:val="17"/>
-              </w:rPr>
-              <w:t xml:space="preserve">    image_bytes = obj["Body"].read()</w:t>
+              <w:t xml:space="preserve">    blob = bucket.blob(key)</w:t>
+            </w:r>
+          </w:p>
+          <w:p>
+            <w:r>
+              <w:rPr>
+                <w:rFonts w:ascii="Consolas" w:hAnsi="Consolas"/>
+                <w:sz w:val="17"/>
+              </w:rPr>
+              <w:t xml:space="preserve">    image_bytes = blob.download_as_bytes()</w:t>
             </w:r>
           </w:p>
           <w:p>
@@ -3226,7 +3249,7 @@
                 <w:rFonts w:ascii="Consolas" w:hAnsi="Consolas"/>
                 <w:sz w:val="17"/>
               </w:rPr>
-              <w:t xml:space="preserve">    # 1. Amazon Rekognition - verify the photo actually contains readable text</w:t>
+              <w:t xml:space="preserve">    # 1. Cloud Vision - verify the photo actually contains readable text</w:t>
             </w:r>
           </w:p>
           <w:p>
@@ -3244,25 +3267,70 @@
                 <w:rFonts w:ascii="Consolas" w:hAnsi="Consolas"/>
                 <w:sz w:val="17"/>
               </w:rPr>
-              <w:t xml:space="preserve">    detected = rekognition.detect_text(Image={"S3Object": {"Bucket": BUCKET, "Name": key}})</w:t>
-            </w:r>
-          </w:p>
-          <w:p>
-            <w:r>
-              <w:rPr>
-                <w:rFonts w:ascii="Consolas" w:hAnsi="Consolas"/>
-                <w:sz w:val="17"/>
-              </w:rPr>
-              <w:t xml:space="preserve">    lines = [d for d in detected["TextDetections"] if d["Type"] == "LINE"]</w:t>
-            </w:r>
-          </w:p>
-          <w:p>
-            <w:r>
-              <w:rPr>
-                <w:rFonts w:ascii="Consolas" w:hAnsi="Consolas"/>
-                <w:sz w:val="17"/>
-              </w:rPr>
-              <w:t xml:space="preserve">    timings["rekognition"] = round(time.time() - t, 2)</w:t>
+              <w:t xml:space="preserve">    result = vision_client.document_text_detection(</w:t>
+            </w:r>
+          </w:p>
+          <w:p>
+            <w:r>
+              <w:rPr>
+                <w:rFonts w:ascii="Consolas" w:hAnsi="Consolas"/>
+                <w:sz w:val="17"/>
+              </w:rPr>
+              <w:t xml:space="preserve">        image=vision.Image(source=vision.ImageSource(gcs_image_uri=f"gs://{BUCKET}/{key}")))</w:t>
+            </w:r>
+          </w:p>
+          <w:p>
+            <w:r>
+              <w:rPr>
+                <w:rFonts w:ascii="Consolas" w:hAnsi="Consolas"/>
+                <w:sz w:val="17"/>
+              </w:rPr>
+              <w:t xml:space="preserve">    if result.error.message:</w:t>
+            </w:r>
+          </w:p>
+          <w:p>
+            <w:r>
+              <w:rPr>
+                <w:rFonts w:ascii="Consolas" w:hAnsi="Consolas"/>
+                <w:sz w:val="17"/>
+              </w:rPr>
+              <w:t xml:space="preserve">        raise RuntimeError(result.error.message)</w:t>
+            </w:r>
+          </w:p>
+          <w:p>
+            <w:r>
+              <w:rPr>
+                <w:rFonts w:ascii="Consolas" w:hAnsi="Consolas"/>
+                <w:sz w:val="17"/>
+              </w:rPr>
+              <w:t xml:space="preserve">    text = result.full_text_annotation.text or ""</w:t>
+            </w:r>
+          </w:p>
+          <w:p>
+            <w:r>
+              <w:rPr>
+                <w:rFonts w:ascii="Consolas" w:hAnsi="Consolas"/>
+                <w:sz w:val="17"/>
+              </w:rPr>
+              <w:t xml:space="preserve">    lines = [l for l in text.split("\n") if l.strip()]</w:t>
+            </w:r>
+          </w:p>
+          <w:p>
+            <w:r>
+              <w:rPr>
+                <w:rFonts w:ascii="Consolas" w:hAnsi="Consolas"/>
+                <w:sz w:val="17"/>
+              </w:rPr>
+              <w:t xml:space="preserve">    blocks = [b for p in result.full_text_annotation.pages for b in p.blocks]</w:t>
+            </w:r>
+          </w:p>
+          <w:p>
+            <w:r>
+              <w:rPr>
+                <w:rFonts w:ascii="Consolas" w:hAnsi="Consolas"/>
+                <w:sz w:val="17"/>
+              </w:rPr>
+              <w:t xml:space="preserve">    timings["vision"] = round(time.time() - t, 2)</w:t>
             </w:r>
           </w:p>
           <w:p>
@@ -3289,7 +3357,7 @@
                 <w:rFonts w:ascii="Consolas" w:hAnsi="Consolas"/>
                 <w:sz w:val="17"/>
               </w:rPr>
-              <w:t xml:space="preserve">    ocr_confidence = round(sum(l["Confidence"] for l in lines) / len(lines), 1)</w:t>
+              <w:t xml:space="preserve">    ocr_confidence = round(100 * sum(b.confidence for b in blocks) / max(len(blocks), 1), 1)</w:t>
             </w:r>
           </w:p>
           <w:p>
@@ -3307,7 +3375,7 @@
                 <w:rFonts w:ascii="Consolas" w:hAnsi="Consolas"/>
                 <w:sz w:val="17"/>
               </w:rPr>
-              <w:t xml:space="preserve">    # 2. Amazon Bedrock (Amazon Nova) - read, understand, simplify and translate</w:t>
+              <w:t xml:space="preserve">    # 2. Vertex AI (Gemini) - read, understand, simplify and translate</w:t>
             </w:r>
           </w:p>
           <w:p>
@@ -3325,24 +3393,25 @@
                 <w:rFonts w:ascii="Consolas" w:hAnsi="Consolas"/>
                 <w:sz w:val="17"/>
               </w:rPr>
-              <w:t xml:space="preserve">    analysis = analyse_with_bedrock(image_bytes, "png" if key.endswith("png") else "jpeg", lang)</w:t>
-            </w:r>
-          </w:p>
-          <w:p>
-            <w:r>
-              <w:rPr>
-                <w:rFonts w:ascii="Consolas" w:hAnsi="Consolas"/>
-                <w:sz w:val="17"/>
-              </w:rPr>
-              <w:t xml:space="preserve">    timings["bedrock"] = round(time.time() - t, 2)</w:t>
-            </w:r>
-          </w:p>
-          <w:p>
-            <w:r>
-              <w:rPr>
-                <w:rFonts w:ascii="Consolas" w:hAnsi="Consolas"/>
-                <w:sz w:val="17"/>
-              </w:rPr>
+              <w:t xml:space="preserve">    analysis = analyse_with_gemini(image_bytes, "image/png" if key.endswith("png") else "image/jpeg", lang)</w:t>
+            </w:r>
+          </w:p>
+          <w:p>
+            <w:r>
+              <w:rPr>
+                <w:rFonts w:ascii="Consolas" w:hAnsi="Consolas"/>
+                <w:sz w:val="17"/>
+              </w:rPr>
+              <w:t xml:space="preserve">    timings["gemini"] = round(time.time() - t, 2)</w:t>
+            </w:r>
+          </w:p>
+          <w:p>
+            <w:r>
+              <w:rPr>
+                <w:rFonts w:ascii="Consolas" w:hAnsi="Consolas"/>
+                <w:sz w:val="17"/>
+              </w:rPr>
+              <w:lastRenderedPageBreak/>
               <w:t xml:space="preserve"> </w:t>
             </w:r>
           </w:p>
@@ -3352,7 +3421,7 @@
                 <w:rFonts w:ascii="Consolas" w:hAnsi="Consolas"/>
                 <w:sz w:val="17"/>
               </w:rPr>
-              <w:t xml:space="preserve">    # 3. Amazon Polly - convert the simplified explanation into speech</w:t>
+              <w:t xml:space="preserve">    # 3. Cloud Text-to-Speech - convert the simplified explanation into speech</w:t>
             </w:r>
           </w:p>
           <w:p>
@@ -3370,44 +3439,7 @@
                 <w:rFonts w:ascii="Consolas" w:hAnsi="Consolas"/>
                 <w:sz w:val="17"/>
               </w:rPr>
-              <w:t xml:space="preserve">    voice = LANGUAGES[lang]</w:t>
-            </w:r>
-          </w:p>
-          <w:p>
-            <w:r>
-              <w:rPr>
-                <w:rFonts w:ascii="Consolas" w:hAnsi="Consolas"/>
-                <w:sz w:val="17"/>
-              </w:rPr>
-              <w:lastRenderedPageBreak/>
-              <w:t xml:space="preserve">    speech = polly.synthesize_speech(</w:t>
-            </w:r>
-          </w:p>
-          <w:p>
-            <w:r>
-              <w:rPr>
-                <w:rFonts w:ascii="Consolas" w:hAnsi="Consolas"/>
-                <w:sz w:val="17"/>
-              </w:rPr>
-              <w:t xml:space="preserve">        Text=analysis["spoken_summary"][:2900], OutputFormat="mp3", Engine="neural",</w:t>
-            </w:r>
-          </w:p>
-          <w:p>
-            <w:r>
-              <w:rPr>
-                <w:rFonts w:ascii="Consolas" w:hAnsi="Consolas"/>
-                <w:sz w:val="17"/>
-              </w:rPr>
-              <w:t xml:space="preserve">        VoiceId=voice["voice"], LanguageCode=voice["code"],</w:t>
-            </w:r>
-          </w:p>
-          <w:p>
-            <w:r>
-              <w:rPr>
-                <w:rFonts w:ascii="Consolas" w:hAnsi="Consolas"/>
-                <w:sz w:val="17"/>
-              </w:rPr>
-              <w:t xml:space="preserve">    )</w:t>
+              <w:t xml:space="preserve">    audio = synthesize(analysis["spoken_summary"][:2900], lang)</w:t>
             </w:r>
           </w:p>
           <w:p>
@@ -3425,25 +3457,16 @@
                 <w:rFonts w:ascii="Consolas" w:hAnsi="Consolas"/>
                 <w:sz w:val="17"/>
               </w:rPr>
-              <w:t xml:space="preserve">    s3.put_object(Bucket=BUCKET, Key=audio_key, Body=speech["AudioStream"].read(),</w:t>
-            </w:r>
-          </w:p>
-          <w:p>
-            <w:r>
-              <w:rPr>
-                <w:rFonts w:ascii="Consolas" w:hAnsi="Consolas"/>
-                <w:sz w:val="17"/>
-              </w:rPr>
-              <w:t xml:space="preserve">                  ContentType="audio/mpeg")</w:t>
-            </w:r>
-          </w:p>
-          <w:p>
-            <w:r>
-              <w:rPr>
-                <w:rFonts w:ascii="Consolas" w:hAnsi="Consolas"/>
-                <w:sz w:val="17"/>
-              </w:rPr>
-              <w:t xml:space="preserve">    timings["polly"] = round(time.time() - t, 2)</w:t>
+              <w:t xml:space="preserve">    bucket.blob(audio_key).upload_from_string(audio, content_type="audio/mpeg")</w:t>
+            </w:r>
+          </w:p>
+          <w:p>
+            <w:r>
+              <w:rPr>
+                <w:rFonts w:ascii="Consolas" w:hAnsi="Consolas"/>
+                <w:sz w:val="17"/>
+              </w:rPr>
+              <w:t xml:space="preserve">    timings["tts"] = round(time.time() - t, 2)</w:t>
             </w:r>
           </w:p>
           <w:p>
@@ -3461,7 +3484,7 @@
                 <w:rFonts w:ascii="Consolas" w:hAnsi="Consolas"/>
                 <w:sz w:val="17"/>
               </w:rPr>
-              <w:t xml:space="preserve">    # 4. Amazon DynamoDB - persist the result</w:t>
+              <w:t xml:space="preserve">    # 4. Firestore - persist the result</w:t>
             </w:r>
           </w:p>
           <w:p>
@@ -3479,15 +3502,6 @@
                 <w:rFonts w:ascii="Consolas" w:hAnsi="Consolas"/>
                 <w:sz w:val="17"/>
               </w:rPr>
-              <w:t xml:space="preserve">        "pk": "DOC",</w:t>
-            </w:r>
-          </w:p>
-          <w:p>
-            <w:r>
-              <w:rPr>
-                <w:rFonts w:ascii="Consolas" w:hAnsi="Consolas"/>
-                <w:sz w:val="17"/>
-              </w:rPr>
               <w:t xml:space="preserve">        "createdAt": int(time.time() * 1000),</w:t>
             </w:r>
           </w:p>
@@ -3605,16 +3619,16 @@
                 <w:rFonts w:ascii="Consolas" w:hAnsi="Consolas"/>
                 <w:sz w:val="17"/>
               </w:rPr>
-              <w:t xml:space="preserve">        "ocrConfidence": Decimal(str(ocr_confidence)),</w:t>
-            </w:r>
-          </w:p>
-          <w:p>
-            <w:r>
-              <w:rPr>
-                <w:rFonts w:ascii="Consolas" w:hAnsi="Consolas"/>
-                <w:sz w:val="17"/>
-              </w:rPr>
-              <w:t xml:space="preserve">        "timings": {k: Decimal(str(v)) for k, v in timings.items()},</w:t>
+              <w:t xml:space="preserve">        "ocrConfidence": ocr_confidence,</w:t>
+            </w:r>
+          </w:p>
+          <w:p>
+            <w:r>
+              <w:rPr>
+                <w:rFonts w:ascii="Consolas" w:hAnsi="Consolas"/>
+                <w:sz w:val="17"/>
+              </w:rPr>
+              <w:t xml:space="preserve">        "timings": timings,</w:t>
             </w:r>
           </w:p>
           <w:p>
@@ -3632,7 +3646,7 @@
                 <w:rFonts w:ascii="Consolas" w:hAnsi="Consolas"/>
                 <w:sz w:val="17"/>
               </w:rPr>
-              <w:t xml:space="preserve">    table.put_item(Item=record)</w:t>
+              <w:t xml:space="preserve">    db.collection(COLLECTION).document(f"{doc_id}-{lang}").set(record)</w:t>
             </w:r>
           </w:p>
           <w:p>
@@ -3663,7 +3677,7 @@
           <w:color w:val="1F3864"/>
           <w:sz w:val="26"/>
         </w:rPr>
-        <w:t>4.3  Lambda: Amazon Bedrock prompt and call</w:t>
+        <w:t>4.3  Gemini prompt and Vertex AI call</w:t>
       </w:r>
     </w:p>
     <w:p>
@@ -3676,7 +3690,7 @@
           <w:b/>
           <w:sz w:val="22"/>
         </w:rPr>
-        <w:t>backend/lambda_function.py: prompt and analyse_with_bedrock</w:t>
+        <w:t>backend/main.py: prompt and analyse_with_gemini</w:t>
       </w:r>
     </w:p>
     <w:tbl>
@@ -3709,7 +3723,7 @@
                 <w:rFonts w:ascii="Consolas" w:hAnsi="Consolas"/>
                 <w:sz w:val="17"/>
               </w:rPr>
-              <w:t>Look at the photographed document and reply with ONLY a JSON object (no markdown) with these keys:</w:t>
+              <w:t>Look at the photographed document and reply with ONLY a JSON object with these keys:</w:t>
             </w:r>
           </w:p>
           <w:p>
@@ -3808,88 +3822,142 @@
                 <w:rFonts w:ascii="Consolas" w:hAnsi="Consolas"/>
                 <w:sz w:val="17"/>
               </w:rPr>
-              <w:t>def analyse_with_bedrock(image_bytes, fmt, lang):</w:t>
-            </w:r>
-          </w:p>
-          <w:p>
-            <w:r>
-              <w:rPr>
-                <w:rFonts w:ascii="Consolas" w:hAnsi="Consolas"/>
-                <w:sz w:val="17"/>
-              </w:rPr>
-              <w:t xml:space="preserve">    response = bedrock.converse(</w:t>
-            </w:r>
-          </w:p>
-          <w:p>
-            <w:r>
-              <w:rPr>
-                <w:rFonts w:ascii="Consolas" w:hAnsi="Consolas"/>
-                <w:sz w:val="17"/>
-              </w:rPr>
-              <w:t xml:space="preserve">        modelId=MODEL_ID,</w:t>
-            </w:r>
-          </w:p>
-          <w:p>
-            <w:r>
-              <w:rPr>
-                <w:rFonts w:ascii="Consolas" w:hAnsi="Consolas"/>
-                <w:sz w:val="17"/>
-              </w:rPr>
-              <w:t xml:space="preserve">        messages=[{"role": "user", "content": [</w:t>
-            </w:r>
-          </w:p>
-          <w:p>
-            <w:r>
-              <w:rPr>
-                <w:rFonts w:ascii="Consolas" w:hAnsi="Consolas"/>
-                <w:sz w:val="17"/>
-              </w:rPr>
-              <w:t xml:space="preserve">            {"image": {"format": fmt, "source": {"bytes": image_bytes}}},</w:t>
-            </w:r>
-          </w:p>
-          <w:p>
-            <w:r>
-              <w:rPr>
-                <w:rFonts w:ascii="Consolas" w:hAnsi="Consolas"/>
-                <w:sz w:val="17"/>
-              </w:rPr>
-              <w:t xml:space="preserve">            {"text": PROMPT.replace("{language}", LANGUAGES[lang]["name"])},</w:t>
-            </w:r>
-          </w:p>
-          <w:p>
-            <w:r>
-              <w:rPr>
-                <w:rFonts w:ascii="Consolas" w:hAnsi="Consolas"/>
-                <w:sz w:val="17"/>
-              </w:rPr>
-              <w:t xml:space="preserve">        ]}],</w:t>
-            </w:r>
-          </w:p>
-          <w:p>
-            <w:r>
-              <w:rPr>
-                <w:rFonts w:ascii="Consolas" w:hAnsi="Consolas"/>
-                <w:sz w:val="17"/>
-              </w:rPr>
-              <w:t xml:space="preserve">        inferenceConfig={"maxTokens": 3000, "temperature": 0.2},</w:t>
-            </w:r>
-          </w:p>
-          <w:p>
-            <w:r>
-              <w:rPr>
-                <w:rFonts w:ascii="Consolas" w:hAnsi="Consolas"/>
-                <w:sz w:val="17"/>
-              </w:rPr>
-              <w:t xml:space="preserve">    )</w:t>
-            </w:r>
-          </w:p>
-          <w:p>
-            <w:r>
-              <w:rPr>
-                <w:rFonts w:ascii="Consolas" w:hAnsi="Consolas"/>
-                <w:sz w:val="17"/>
-              </w:rPr>
-              <w:t xml:space="preserve">    text = response["output"]["message"]["content"][0]["text"]</w:t>
+              <w:t>def analyse_with_gemini(image_bytes, mime, lang):</w:t>
+            </w:r>
+          </w:p>
+          <w:p>
+            <w:r>
+              <w:rPr>
+                <w:rFonts w:ascii="Consolas" w:hAnsi="Consolas"/>
+                <w:sz w:val="17"/>
+              </w:rPr>
+              <w:t xml:space="preserve">    contents = [types.Part.from_bytes(data=image_bytes, mime_type=mime),</w:t>
+            </w:r>
+          </w:p>
+          <w:p>
+            <w:r>
+              <w:rPr>
+                <w:rFonts w:ascii="Consolas" w:hAnsi="Consolas"/>
+                <w:sz w:val="17"/>
+              </w:rPr>
+              <w:t xml:space="preserve">                PROMPT.replace("{language}", LANGUAGES[lang]["name"])]</w:t>
+            </w:r>
+          </w:p>
+          <w:p>
+            <w:r>
+              <w:rPr>
+                <w:rFonts w:ascii="Consolas" w:hAnsi="Consolas"/>
+                <w:sz w:val="17"/>
+              </w:rPr>
+              <w:t xml:space="preserve">    base = dict(temperature=0.2, max_output_tokens=4096, response_mime_type="application/json")</w:t>
+            </w:r>
+          </w:p>
+          <w:p>
+            <w:r>
+              <w:rPr>
+                <w:rFonts w:ascii="Consolas" w:hAnsi="Consolas"/>
+                <w:sz w:val="17"/>
+              </w:rPr>
+              <w:t xml:space="preserve">    try:</w:t>
+            </w:r>
+          </w:p>
+          <w:p>
+            <w:r>
+              <w:rPr>
+                <w:rFonts w:ascii="Consolas" w:hAnsi="Consolas"/>
+                <w:sz w:val="17"/>
+              </w:rPr>
+              <w:t xml:space="preserve">        # Thinking off: transcription and summarising need no long reasoning, and</w:t>
+            </w:r>
+          </w:p>
+          <w:p>
+            <w:r>
+              <w:rPr>
+                <w:rFonts w:ascii="Consolas" w:hAnsi="Consolas"/>
+                <w:sz w:val="17"/>
+              </w:rPr>
+              <w:t xml:space="preserve">        # thinking tokens add latency and are billed as output tokens.</w:t>
+            </w:r>
+          </w:p>
+          <w:p>
+            <w:r>
+              <w:rPr>
+                <w:rFonts w:ascii="Consolas" w:hAnsi="Consolas"/>
+                <w:sz w:val="17"/>
+              </w:rPr>
+              <w:t xml:space="preserve">        response = gemini.models.generate_content(</w:t>
+            </w:r>
+          </w:p>
+          <w:p>
+            <w:r>
+              <w:rPr>
+                <w:rFonts w:ascii="Consolas" w:hAnsi="Consolas"/>
+                <w:sz w:val="17"/>
+              </w:rPr>
+              <w:t xml:space="preserve">            model=MODEL_ID, contents=contents,</w:t>
+            </w:r>
+          </w:p>
+          <w:p>
+            <w:r>
+              <w:rPr>
+                <w:rFonts w:ascii="Consolas" w:hAnsi="Consolas"/>
+                <w:sz w:val="17"/>
+              </w:rPr>
+              <w:t xml:space="preserve">            config=types.GenerateContentConfig(</w:t>
+            </w:r>
+          </w:p>
+          <w:p>
+            <w:r>
+              <w:rPr>
+                <w:rFonts w:ascii="Consolas" w:hAnsi="Consolas"/>
+                <w:sz w:val="17"/>
+              </w:rPr>
+              <w:t xml:space="preserve">                **base, thinking_config=types.ThinkingConfig(thinking_budget=0)))</w:t>
+            </w:r>
+          </w:p>
+          <w:p>
+            <w:r>
+              <w:rPr>
+                <w:rFonts w:ascii="Consolas" w:hAnsi="Consolas"/>
+                <w:sz w:val="17"/>
+              </w:rPr>
+              <w:t xml:space="preserve">    except Exception as e:  # model does not allow turning thinking off</w:t>
+            </w:r>
+          </w:p>
+          <w:p>
+            <w:r>
+              <w:rPr>
+                <w:rFonts w:ascii="Consolas" w:hAnsi="Consolas"/>
+                <w:sz w:val="17"/>
+              </w:rPr>
+              <w:t xml:space="preserve">        print("Gemini thinking_budget fallback", repr(e))</w:t>
+            </w:r>
+          </w:p>
+          <w:p>
+            <w:r>
+              <w:rPr>
+                <w:rFonts w:ascii="Consolas" w:hAnsi="Consolas"/>
+                <w:sz w:val="17"/>
+              </w:rPr>
+              <w:t xml:space="preserve">        response = gemini.models.generate_content(</w:t>
+            </w:r>
+          </w:p>
+          <w:p>
+            <w:r>
+              <w:rPr>
+                <w:rFonts w:ascii="Consolas" w:hAnsi="Consolas"/>
+                <w:sz w:val="17"/>
+              </w:rPr>
+              <w:t xml:space="preserve">            model=MODEL_ID, contents=contents, config=types.GenerateContentConfig(**base))</w:t>
+            </w:r>
+          </w:p>
+          <w:p>
+            <w:r>
+              <w:rPr>
+                <w:rFonts w:ascii="Consolas" w:hAnsi="Consolas"/>
+                <w:sz w:val="17"/>
+              </w:rPr>
+              <w:t xml:space="preserve">    text = response.text or ""</w:t>
             </w:r>
           </w:p>
           <w:p>
@@ -3934,6 +4002,7 @@
                 <w:rFonts w:ascii="Consolas" w:hAnsi="Consolas"/>
                 <w:sz w:val="17"/>
               </w:rPr>
+              <w:lastRenderedPageBreak/>
               <w:t xml:space="preserve">    data["key_points"] = [str(x) for x in data.get("key_points") or []][:5]</w:t>
             </w:r>
           </w:p>
@@ -3992,7 +4061,7 @@
           <w:color w:val="1F3864"/>
           <w:sz w:val="26"/>
         </w:rPr>
-        <w:t>4.4  IAM least-privilege policy</w:t>
+        <w:t>4.4  Signed Cloud Storage URLs</w:t>
       </w:r>
     </w:p>
     <w:p>
@@ -4005,7 +4074,7 @@
           <w:b/>
           <w:sz w:val="22"/>
         </w:rPr>
-        <w:t>infra/lambda-policy.json</w:t>
+        <w:t>backend/main.py: signed_url</w:t>
       </w:r>
     </w:p>
     <w:tbl>
@@ -4029,124 +4098,88 @@
                 <w:rFonts w:ascii="Consolas" w:hAnsi="Consolas"/>
                 <w:sz w:val="17"/>
               </w:rPr>
-              <w:t>{</w:t>
-            </w:r>
-          </w:p>
-          <w:p>
-            <w:r>
-              <w:rPr>
-                <w:rFonts w:ascii="Consolas" w:hAnsi="Consolas"/>
-                <w:sz w:val="17"/>
-              </w:rPr>
-              <w:t xml:space="preserve">  "Version": "2012-10-17",</w:t>
-            </w:r>
-          </w:p>
-          <w:p>
-            <w:r>
-              <w:rPr>
-                <w:rFonts w:ascii="Consolas" w:hAnsi="Consolas"/>
-                <w:sz w:val="17"/>
-              </w:rPr>
-              <w:t xml:space="preserve">  "Statement": [</w:t>
-            </w:r>
-          </w:p>
-          <w:p>
-            <w:r>
-              <w:rPr>
-                <w:rFonts w:ascii="Consolas" w:hAnsi="Consolas"/>
-                <w:sz w:val="17"/>
-              </w:rPr>
-              <w:t xml:space="preserve">    {"Sid": "MediaBucket", "Effect": "Allow", "Action": ["s3:GetObject", "s3:PutObject"],</w:t>
-            </w:r>
-          </w:p>
-          <w:p>
-            <w:r>
-              <w:rPr>
-                <w:rFonts w:ascii="Consolas" w:hAnsi="Consolas"/>
-                <w:sz w:val="17"/>
-              </w:rPr>
-              <w:t xml:space="preserve">     "Resource": "arn:aws:s3:::__MEDIA__/*"},</w:t>
-            </w:r>
-          </w:p>
-          <w:p>
-            <w:r>
-              <w:rPr>
-                <w:rFonts w:ascii="Consolas" w:hAnsi="Consolas"/>
-                <w:sz w:val="17"/>
-              </w:rPr>
-              <w:t xml:space="preserve">    {"Sid": "DocumentsTable", "Effect": "Allow", "Action": ["dynamodb:PutItem", "dynamodb:Query"],</w:t>
-            </w:r>
-          </w:p>
-          <w:p>
-            <w:r>
-              <w:rPr>
-                <w:rFonts w:ascii="Consolas" w:hAnsi="Consolas"/>
-                <w:sz w:val="17"/>
-              </w:rPr>
-              <w:t xml:space="preserve">     "Resource": "arn:aws:dynamodb:ap-south-1:__ACCOUNT__:table/__TABLE__"},</w:t>
-            </w:r>
-          </w:p>
-          <w:p>
-            <w:r>
-              <w:rPr>
-                <w:rFonts w:ascii="Consolas" w:hAnsi="Consolas"/>
-                <w:sz w:val="17"/>
-              </w:rPr>
-              <w:t xml:space="preserve">    {"Sid": "TextDetection", "Effect": "Allow", "Action": "rekognition:DetectText", "Resource": "*"},</w:t>
-            </w:r>
-          </w:p>
-          <w:p>
-            <w:r>
-              <w:rPr>
-                <w:rFonts w:ascii="Consolas" w:hAnsi="Consolas"/>
-                <w:sz w:val="17"/>
-              </w:rPr>
-              <w:t xml:space="preserve">    {"Sid": "SpeechSynthesis", "Effect": "Allow", "Action": "polly:SynthesizeSpeech", "Resource": "*"},</w:t>
-            </w:r>
-          </w:p>
-          <w:p>
-            <w:r>
-              <w:rPr>
-                <w:rFonts w:ascii="Consolas" w:hAnsi="Consolas"/>
-                <w:sz w:val="17"/>
-              </w:rPr>
-              <w:t xml:space="preserve">    {"Sid": "NovaOnBedrock", "Effect": "Allow", "Action": "bedrock:InvokeModel",</w:t>
-            </w:r>
-          </w:p>
-          <w:p>
-            <w:r>
-              <w:rPr>
-                <w:rFonts w:ascii="Consolas" w:hAnsi="Consolas"/>
-                <w:sz w:val="17"/>
-              </w:rPr>
-              <w:t xml:space="preserve">     "Resource": ["arn:aws:bedrock:*:__ACCOUNT__:inference-profile/global.amazon.nova-2-lite*",</w:t>
-            </w:r>
-          </w:p>
-          <w:p>
-            <w:r>
-              <w:rPr>
-                <w:rFonts w:ascii="Consolas" w:hAnsi="Consolas"/>
-                <w:sz w:val="17"/>
-              </w:rPr>
-              <w:t xml:space="preserve">                  "arn:aws:bedrock:*::foundation-model/amazon.nova-2-lite*"]}</w:t>
-            </w:r>
-          </w:p>
-          <w:p>
-            <w:r>
-              <w:rPr>
-                <w:rFonts w:ascii="Consolas" w:hAnsi="Consolas"/>
-                <w:sz w:val="17"/>
-              </w:rPr>
-              <w:t xml:space="preserve">  ]</w:t>
-            </w:r>
-          </w:p>
-          <w:p>
-            <w:r>
-              <w:rPr>
-                <w:rFonts w:ascii="Consolas" w:hAnsi="Consolas"/>
-                <w:sz w:val="17"/>
-              </w:rPr>
-              <w:t>}</w:t>
+              <w:t>def signed_url(key, method, minutes, content_type=None):</w:t>
+            </w:r>
+          </w:p>
+          <w:p>
+            <w:r>
+              <w:rPr>
+                <w:rFonts w:ascii="Consolas" w:hAnsi="Consolas"/>
+                <w:sz w:val="17"/>
+              </w:rPr>
+              <w:t xml:space="preserve">    """V4 signed URL. Cloud Run has no private key, so signing goes through the</w:t>
+            </w:r>
+          </w:p>
+          <w:p>
+            <w:r>
+              <w:rPr>
+                <w:rFonts w:ascii="Consolas" w:hAnsi="Consolas"/>
+                <w:sz w:val="17"/>
+              </w:rPr>
+              <w:t xml:space="preserve">    IAM Credentials signBlob API using the function's own service account."""</w:t>
+            </w:r>
+          </w:p>
+          <w:p>
+            <w:r>
+              <w:rPr>
+                <w:rFonts w:ascii="Consolas" w:hAnsi="Consolas"/>
+                <w:sz w:val="17"/>
+              </w:rPr>
+              <w:t xml:space="preserve">    if not credentials.valid:</w:t>
+            </w:r>
+          </w:p>
+          <w:p>
+            <w:r>
+              <w:rPr>
+                <w:rFonts w:ascii="Consolas" w:hAnsi="Consolas"/>
+                <w:sz w:val="17"/>
+              </w:rPr>
+              <w:t xml:space="preserve">        credentials.refresh(google_requests.Request())</w:t>
+            </w:r>
+          </w:p>
+          <w:p>
+            <w:r>
+              <w:rPr>
+                <w:rFonts w:ascii="Consolas" w:hAnsi="Consolas"/>
+                <w:sz w:val="17"/>
+              </w:rPr>
+              <w:t xml:space="preserve">    return bucket.blob(key).generate_signed_url(</w:t>
+            </w:r>
+          </w:p>
+          <w:p>
+            <w:r>
+              <w:rPr>
+                <w:rFonts w:ascii="Consolas" w:hAnsi="Consolas"/>
+                <w:sz w:val="17"/>
+              </w:rPr>
+              <w:t xml:space="preserve">        version="v4", method=method, expiration=datetime.timedelta(minutes=minutes),</w:t>
+            </w:r>
+          </w:p>
+          <w:p>
+            <w:r>
+              <w:rPr>
+                <w:rFonts w:ascii="Consolas" w:hAnsi="Consolas"/>
+                <w:sz w:val="17"/>
+              </w:rPr>
+              <w:t xml:space="preserve">        content_type=content_type, service_account_email=credentials.service_account_email,</w:t>
+            </w:r>
+          </w:p>
+          <w:p>
+            <w:r>
+              <w:rPr>
+                <w:rFonts w:ascii="Consolas" w:hAnsi="Consolas"/>
+                <w:sz w:val="17"/>
+              </w:rPr>
+              <w:t xml:space="preserve">        access_token=credentials.token,</w:t>
+            </w:r>
+          </w:p>
+          <w:p>
+            <w:r>
+              <w:rPr>
+                <w:rFonts w:ascii="Consolas" w:hAnsi="Consolas"/>
+                <w:sz w:val="17"/>
+              </w:rPr>
+              <w:t xml:space="preserve">    )</w:t>
             </w:r>
           </w:p>
         </w:tc>
@@ -4158,6 +4191,11 @@
       </w:pPr>
     </w:p>
     <w:p>
+      <w:r>
+        <w:br w:type="page"/>
+      </w:r>
+    </w:p>
+    <w:p>
       <w:pPr>
         <w:keepNext/>
         <w:spacing w:before="200" w:after="80" w:line="276" w:lineRule="auto"/>
@@ -4168,7 +4206,7 @@
           <w:color w:val="1F3864"/>
           <w:sz w:val="26"/>
         </w:rPr>
-        <w:t>4.5  Frontend: upload and processing</w:t>
+        <w:t>4.5  Least-privilege service accounts</w:t>
       </w:r>
     </w:p>
     <w:p>
@@ -4181,7 +4219,7 @@
           <w:b/>
           <w:sz w:val="22"/>
         </w:rPr>
-        <w:t>frontend/app.js: direct-to-S3 upload and pipeline call</w:t>
+        <w:t>infra/deploy.sh: service accounts and roles</w:t>
       </w:r>
     </w:p>
     <w:tbl>
@@ -4205,295 +4243,169 @@
                 <w:rFonts w:ascii="Consolas" w:hAnsi="Consolas"/>
                 <w:sz w:val="17"/>
               </w:rPr>
-              <w:t>$("go").addEventListener("click", async () =&gt; {</w:t>
-            </w:r>
-          </w:p>
-          <w:p>
-            <w:r>
-              <w:rPr>
-                <w:rFonts w:ascii="Consolas" w:hAnsi="Consolas"/>
-                <w:sz w:val="17"/>
-              </w:rPr>
-              <w:t xml:space="preserve">  if (!imageBlob) return;</w:t>
-            </w:r>
-          </w:p>
-          <w:p>
-            <w:r>
-              <w:rPr>
-                <w:rFonts w:ascii="Consolas" w:hAnsi="Consolas"/>
-                <w:sz w:val="17"/>
-              </w:rPr>
-              <w:t xml:space="preserve">  hideError();</w:t>
-            </w:r>
-          </w:p>
-          <w:p>
-            <w:r>
-              <w:rPr>
-                <w:rFonts w:ascii="Consolas" w:hAnsi="Consolas"/>
-                <w:sz w:val="17"/>
-              </w:rPr>
-              <w:t xml:space="preserve">  $("go").disabled = true;</w:t>
-            </w:r>
-          </w:p>
-          <w:p>
-            <w:r>
-              <w:rPr>
-                <w:rFonts w:ascii="Consolas" w:hAnsi="Consolas"/>
-                <w:sz w:val="17"/>
-              </w:rPr>
-              <w:t xml:space="preserve">  $("result").hidden = true;</w:t>
-            </w:r>
-          </w:p>
-          <w:p>
-            <w:r>
-              <w:rPr>
-                <w:rFonts w:ascii="Consolas" w:hAnsi="Consolas"/>
-                <w:sz w:val="17"/>
-              </w:rPr>
-              <w:t xml:space="preserve">  $("empty").hidden = false;</w:t>
-            </w:r>
-          </w:p>
-          <w:p>
-            <w:r>
-              <w:rPr>
-                <w:rFonts w:ascii="Consolas" w:hAnsi="Consolas"/>
-                <w:sz w:val="17"/>
-              </w:rPr>
-              <w:t xml:space="preserve">  $("empty").classList.add("busy");</w:t>
-            </w:r>
-          </w:p>
-          <w:p>
-            <w:r>
-              <w:rPr>
-                <w:rFonts w:ascii="Consolas" w:hAnsi="Consolas"/>
-                <w:sz w:val="17"/>
-              </w:rPr>
-              <w:t xml:space="preserve">  $("empty").querySelector("p").textContent = "Reading your document…";</w:t>
-            </w:r>
-          </w:p>
-          <w:p>
-            <w:r>
-              <w:rPr>
-                <w:rFonts w:ascii="Consolas" w:hAnsi="Consolas"/>
-                <w:sz w:val="17"/>
-              </w:rPr>
-              <w:t xml:space="preserve">  let ticker;</w:t>
-            </w:r>
-          </w:p>
-          <w:p>
-            <w:r>
-              <w:rPr>
-                <w:rFonts w:ascii="Consolas" w:hAnsi="Consolas"/>
-                <w:sz w:val="17"/>
-              </w:rPr>
-              <w:t xml:space="preserve">  try {</w:t>
-            </w:r>
-          </w:p>
-          <w:p>
-            <w:r>
-              <w:rPr>
-                <w:rFonts w:ascii="Consolas" w:hAnsi="Consolas"/>
-                <w:sz w:val="17"/>
-              </w:rPr>
-              <w:t xml:space="preserve">    setStep("upload");</w:t>
-            </w:r>
-          </w:p>
-          <w:p>
-            <w:r>
-              <w:rPr>
-                <w:rFonts w:ascii="Consolas" w:hAnsi="Consolas"/>
-                <w:sz w:val="17"/>
-              </w:rPr>
-              <w:t xml:space="preserve">    const up = await api("/upload-url", { contentType: "image/jpeg" });</w:t>
-            </w:r>
-          </w:p>
-          <w:p>
-            <w:r>
-              <w:rPr>
-                <w:rFonts w:ascii="Consolas" w:hAnsi="Consolas"/>
-                <w:sz w:val="17"/>
-              </w:rPr>
-              <w:t xml:space="preserve">    const put = await fetch(up.uploadUrl, { method: "PUT", headers: { "Content-Type": "image/jpeg" }, body: imageBlob });</w:t>
-            </w:r>
-          </w:p>
-          <w:p>
-            <w:r>
-              <w:rPr>
-                <w:rFonts w:ascii="Consolas" w:hAnsi="Consolas"/>
-                <w:sz w:val="17"/>
-              </w:rPr>
-              <w:t xml:space="preserve">    if (!put.ok) throw new Error("Upload to S3 failed");</w:t>
-            </w:r>
-          </w:p>
-          <w:p>
-            <w:r>
-              <w:rPr>
-                <w:rFonts w:ascii="Consolas" w:hAnsi="Consolas"/>
-                <w:sz w:val="17"/>
-              </w:rPr>
-              <w:t xml:space="preserve"> </w:t>
-            </w:r>
-          </w:p>
-          <w:p>
-            <w:r>
-              <w:rPr>
-                <w:rFonts w:ascii="Consolas" w:hAnsi="Consolas"/>
-                <w:sz w:val="17"/>
-              </w:rPr>
-              <w:t xml:space="preserve">    // The server runs the remaining stages in one call; animate them while we wait.</w:t>
-            </w:r>
-          </w:p>
-          <w:p>
-            <w:r>
-              <w:rPr>
-                <w:rFonts w:ascii="Consolas" w:hAnsi="Consolas"/>
-                <w:sz w:val="17"/>
-              </w:rPr>
-              <w:t xml:space="preserve">    setStep("rekognition");</w:t>
-            </w:r>
-          </w:p>
-          <w:p>
-            <w:r>
-              <w:rPr>
-                <w:rFonts w:ascii="Consolas" w:hAnsi="Consolas"/>
-                <w:sz w:val="17"/>
-              </w:rPr>
-              <w:t xml:space="preserve">    ticker = [setTimeout(() =&gt; setStep("bedrock"), 1200), setTimeout(() =&gt; setStep("polly"), 9000)];</w:t>
-            </w:r>
-          </w:p>
-          <w:p>
-            <w:r>
-              <w:rPr>
-                <w:rFonts w:ascii="Consolas" w:hAnsi="Consolas"/>
-                <w:sz w:val="17"/>
-              </w:rPr>
-              <w:t xml:space="preserve">    const result = await api("/process", { key: up.key, language: selectedLang });</w:t>
-            </w:r>
-          </w:p>
-          <w:p>
-            <w:r>
-              <w:rPr>
-                <w:rFonts w:ascii="Consolas" w:hAnsi="Consolas"/>
-                <w:sz w:val="17"/>
-              </w:rPr>
-              <w:t xml:space="preserve">    ticker.forEach(clearTimeout);</w:t>
-            </w:r>
-          </w:p>
-          <w:p>
-            <w:r>
-              <w:rPr>
-                <w:rFonts w:ascii="Consolas" w:hAnsi="Consolas"/>
-                <w:sz w:val="17"/>
-              </w:rPr>
-              <w:t xml:space="preserve">    setStep("all");</w:t>
-            </w:r>
-          </w:p>
-          <w:p>
-            <w:r>
-              <w:rPr>
-                <w:rFonts w:ascii="Consolas" w:hAnsi="Consolas"/>
-                <w:sz w:val="17"/>
-              </w:rPr>
-              <w:t xml:space="preserve">    showResult(result, true);</w:t>
-            </w:r>
-          </w:p>
-          <w:p>
-            <w:r>
-              <w:rPr>
-                <w:rFonts w:ascii="Consolas" w:hAnsi="Consolas"/>
-                <w:sz w:val="17"/>
-              </w:rPr>
-              <w:t xml:space="preserve">    loadHistory();</w:t>
-            </w:r>
-          </w:p>
-          <w:p>
-            <w:r>
-              <w:rPr>
-                <w:rFonts w:ascii="Consolas" w:hAnsi="Consolas"/>
-                <w:sz w:val="17"/>
-              </w:rPr>
-              <w:t xml:space="preserve">  } catch (err) {</w:t>
-            </w:r>
-          </w:p>
-          <w:p>
-            <w:r>
-              <w:rPr>
-                <w:rFonts w:ascii="Consolas" w:hAnsi="Consolas"/>
-                <w:sz w:val="17"/>
-              </w:rPr>
-              <w:t xml:space="preserve">    (ticker || []).forEach(clearTimeout);</w:t>
-            </w:r>
-          </w:p>
-          <w:p>
-            <w:r>
-              <w:rPr>
-                <w:rFonts w:ascii="Consolas" w:hAnsi="Consolas"/>
-                <w:sz w:val="17"/>
-              </w:rPr>
-              <w:t xml:space="preserve">    setStep("none");</w:t>
-            </w:r>
-          </w:p>
-          <w:p>
-            <w:r>
-              <w:rPr>
-                <w:rFonts w:ascii="Consolas" w:hAnsi="Consolas"/>
-                <w:sz w:val="17"/>
-              </w:rPr>
-              <w:t xml:space="preserve">    showError(err.message);</w:t>
-            </w:r>
-          </w:p>
-          <w:p>
-            <w:r>
-              <w:rPr>
-                <w:rFonts w:ascii="Consolas" w:hAnsi="Consolas"/>
-                <w:sz w:val="17"/>
-              </w:rPr>
-              <w:t xml:space="preserve">    $("empty").querySelector("p").textContent = "Your explanation will appear and play here.";</w:t>
-            </w:r>
-          </w:p>
-          <w:p>
-            <w:r>
-              <w:rPr>
-                <w:rFonts w:ascii="Consolas" w:hAnsi="Consolas"/>
-                <w:sz w:val="17"/>
-              </w:rPr>
-              <w:t xml:space="preserve">  } finally {</w:t>
-            </w:r>
-          </w:p>
-          <w:p>
-            <w:r>
-              <w:rPr>
-                <w:rFonts w:ascii="Consolas" w:hAnsi="Consolas"/>
-                <w:sz w:val="17"/>
-              </w:rPr>
-              <w:t xml:space="preserve">    $("go").disabled = false;</w:t>
-            </w:r>
-          </w:p>
-          <w:p>
-            <w:r>
-              <w:rPr>
-                <w:rFonts w:ascii="Consolas" w:hAnsi="Consolas"/>
-                <w:sz w:val="17"/>
-              </w:rPr>
-              <w:t xml:space="preserve">    $("empty").classList.remove("busy");</w:t>
-            </w:r>
-          </w:p>
-          <w:p>
-            <w:r>
-              <w:rPr>
-                <w:rFonts w:ascii="Consolas" w:hAnsi="Consolas"/>
-                <w:sz w:val="17"/>
-              </w:rPr>
-              <w:t xml:space="preserve">  }</w:t>
-            </w:r>
-          </w:p>
-          <w:p>
-            <w:r>
-              <w:rPr>
-                <w:rFonts w:ascii="Consolas" w:hAnsi="Consolas"/>
-                <w:sz w:val="17"/>
-              </w:rPr>
-              <w:t>});</w:t>
+              <w:t>echo "== Service accounts and roles"</w:t>
+            </w:r>
+          </w:p>
+          <w:p>
+            <w:r>
+              <w:rPr>
+                <w:rFonts w:ascii="Consolas" w:hAnsi="Consolas"/>
+                <w:sz w:val="17"/>
+              </w:rPr>
+              <w:t>for sa in vaanisetu-fn:"VaaniSetu function" vaanisetu-gateway:"VaaniSetu API Gateway" vaanisetu-build:"VaaniSetu function builds"; do</w:t>
+            </w:r>
+          </w:p>
+          <w:p>
+            <w:r>
+              <w:rPr>
+                <w:rFonts w:ascii="Consolas" w:hAnsi="Consolas"/>
+                <w:sz w:val="17"/>
+              </w:rPr>
+              <w:t xml:space="preserve">  id=${sa%%:*}; name=${sa#*:}</w:t>
+            </w:r>
+          </w:p>
+          <w:p>
+            <w:r>
+              <w:rPr>
+                <w:rFonts w:ascii="Consolas" w:hAnsi="Consolas"/>
+                <w:sz w:val="17"/>
+              </w:rPr>
+              <w:t xml:space="preserve">  gcloud iam service-accounts describe "$id@$PROJECT.iam.gserviceaccount.com" &gt;/dev/null 2&gt;&amp;1 || \</w:t>
+            </w:r>
+          </w:p>
+          <w:p>
+            <w:r>
+              <w:rPr>
+                <w:rFonts w:ascii="Consolas" w:hAnsi="Consolas"/>
+                <w:sz w:val="17"/>
+              </w:rPr>
+              <w:t xml:space="preserve">    gcloud iam service-accounts create "$id" --display-name="$name"</w:t>
+            </w:r>
+          </w:p>
+          <w:p>
+            <w:r>
+              <w:rPr>
+                <w:rFonts w:ascii="Consolas" w:hAnsi="Consolas"/>
+                <w:sz w:val="17"/>
+              </w:rPr>
+              <w:t>done</w:t>
+            </w:r>
+          </w:p>
+          <w:p>
+            <w:r>
+              <w:rPr>
+                <w:rFonts w:ascii="Consolas" w:hAnsi="Consolas"/>
+                <w:sz w:val="17"/>
+              </w:rPr>
+              <w:t>sleep 5</w:t>
+            </w:r>
+          </w:p>
+          <w:p>
+            <w:r>
+              <w:rPr>
+                <w:rFonts w:ascii="Consolas" w:hAnsi="Consolas"/>
+                <w:sz w:val="17"/>
+              </w:rPr>
+              <w:t>for role in roles/datastore.user roles/aiplatform.user roles/serviceusage.serviceUsageConsumer roles/logging.logWriter; do</w:t>
+            </w:r>
+          </w:p>
+          <w:p>
+            <w:r>
+              <w:rPr>
+                <w:rFonts w:ascii="Consolas" w:hAnsi="Consolas"/>
+                <w:sz w:val="17"/>
+              </w:rPr>
+              <w:t xml:space="preserve">  gcloud projects add-iam-policy-binding "$PROJECT" --member="serviceAccount:$FN_SA" --role="$role" \</w:t>
+            </w:r>
+          </w:p>
+          <w:p>
+            <w:r>
+              <w:rPr>
+                <w:rFonts w:ascii="Consolas" w:hAnsi="Consolas"/>
+                <w:sz w:val="17"/>
+              </w:rPr>
+              <w:t xml:space="preserve">    --condition=None &gt;/dev/null</w:t>
+            </w:r>
+          </w:p>
+          <w:p>
+            <w:r>
+              <w:rPr>
+                <w:rFonts w:ascii="Consolas" w:hAnsi="Consolas"/>
+                <w:sz w:val="17"/>
+              </w:rPr>
+              <w:t>done</w:t>
+            </w:r>
+          </w:p>
+          <w:p>
+            <w:r>
+              <w:rPr>
+                <w:rFonts w:ascii="Consolas" w:hAnsi="Consolas"/>
+                <w:sz w:val="17"/>
+              </w:rPr>
+              <w:t>for role in roles/storage.objectCreator roles/storage.objectViewer; do</w:t>
+            </w:r>
+          </w:p>
+          <w:p>
+            <w:r>
+              <w:rPr>
+                <w:rFonts w:ascii="Consolas" w:hAnsi="Consolas"/>
+                <w:sz w:val="17"/>
+              </w:rPr>
+              <w:t xml:space="preserve">  gcloud storage buckets add-iam-policy-binding "gs://$MEDIA" --member="serviceAccount:$FN_SA" --role="$role" &gt;/dev/null</w:t>
+            </w:r>
+          </w:p>
+          <w:p>
+            <w:r>
+              <w:rPr>
+                <w:rFonts w:ascii="Consolas" w:hAnsi="Consolas"/>
+                <w:sz w:val="17"/>
+              </w:rPr>
+              <w:t>done</w:t>
+            </w:r>
+          </w:p>
+          <w:p>
+            <w:r>
+              <w:rPr>
+                <w:rFonts w:ascii="Consolas" w:hAnsi="Consolas"/>
+                <w:sz w:val="17"/>
+              </w:rPr>
+              <w:t>gcloud projects add-iam-policy-binding "$PROJECT" --member="serviceAccount:$BUILD_SA" \</w:t>
+            </w:r>
+          </w:p>
+          <w:p>
+            <w:r>
+              <w:rPr>
+                <w:rFonts w:ascii="Consolas" w:hAnsi="Consolas"/>
+                <w:sz w:val="17"/>
+              </w:rPr>
+              <w:t xml:space="preserve">  --role=roles/cloudbuild.builds.builder --condition=None &gt;/dev/null</w:t>
+            </w:r>
+          </w:p>
+          <w:p>
+            <w:r>
+              <w:rPr>
+                <w:rFonts w:ascii="Consolas" w:hAnsi="Consolas"/>
+                <w:sz w:val="17"/>
+              </w:rPr>
+              <w:t># lets the function sign Cloud Storage URLs with its own identity (IAM signBlob)</w:t>
+            </w:r>
+          </w:p>
+          <w:p>
+            <w:r>
+              <w:rPr>
+                <w:rFonts w:ascii="Consolas" w:hAnsi="Consolas"/>
+                <w:sz w:val="17"/>
+              </w:rPr>
+              <w:t>gcloud iam service-accounts add-iam-policy-binding "$FN_SA" --member="serviceAccount:$FN_SA" \</w:t>
+            </w:r>
+          </w:p>
+          <w:p>
+            <w:r>
+              <w:rPr>
+                <w:rFonts w:ascii="Consolas" w:hAnsi="Consolas"/>
+                <w:sz w:val="17"/>
+              </w:rPr>
+              <w:t xml:space="preserve">  --role=roles/iam.serviceAccountTokenCreator &gt;/dev/null</w:t>
             </w:r>
           </w:p>
         </w:tc>
@@ -4505,11 +4417,6 @@
       </w:pPr>
     </w:p>
     <w:p>
-      <w:r>
-        <w:br w:type="page"/>
-      </w:r>
-    </w:p>
-    <w:p>
       <w:pPr>
         <w:keepNext/>
         <w:spacing w:before="200" w:after="80" w:line="276" w:lineRule="auto"/>
@@ -4520,7 +4427,7 @@
           <w:color w:val="1F3864"/>
           <w:sz w:val="26"/>
         </w:rPr>
-        <w:t>4.6  Deployment script (excerpt)</w:t>
+        <w:t>4.6  API Gateway configuration (OpenAPI)</w:t>
       </w:r>
     </w:p>
     <w:p>
@@ -4533,7 +4440,7 @@
           <w:b/>
           <w:sz w:val="22"/>
         </w:rPr>
-        <w:t>infra/deploy.sh: creating the HTTP API and wiring it to Lambda</w:t>
+        <w:t>infra/openapi.template.yaml (excerpt)</w:t>
       </w:r>
     </w:p>
     <w:tbl>
@@ -4557,160 +4464,566 @@
                 <w:rFonts w:ascii="Consolas" w:hAnsi="Consolas"/>
                 <w:sz w:val="17"/>
               </w:rPr>
-              <w:t>echo "== API Gateway (HTTP API)"</w:t>
-            </w:r>
-          </w:p>
-          <w:p>
-            <w:r>
-              <w:rPr>
-                <w:rFonts w:ascii="Consolas" w:hAnsi="Consolas"/>
-                <w:sz w:val="17"/>
-              </w:rPr>
-              <w:t>API_ID=$(aws apigatewayv2 get-apis --query "Items[?Name=='vaanisetu-api'].ApiId" --output text)</w:t>
-            </w:r>
-          </w:p>
-          <w:p>
-            <w:r>
-              <w:rPr>
-                <w:rFonts w:ascii="Consolas" w:hAnsi="Consolas"/>
-                <w:sz w:val="17"/>
-              </w:rPr>
-              <w:t>if [ -z "$API_ID" ] || [ "$API_ID" = "None" ]; then</w:t>
-            </w:r>
-          </w:p>
-          <w:p>
-            <w:r>
-              <w:rPr>
-                <w:rFonts w:ascii="Consolas" w:hAnsi="Consolas"/>
-                <w:sz w:val="17"/>
-              </w:rPr>
-              <w:t xml:space="preserve">  API_ID=$(aws apigatewayv2 create-api --name vaanisetu-api --protocol-type HTTP \</w:t>
-            </w:r>
-          </w:p>
-          <w:p>
-            <w:r>
-              <w:rPr>
-                <w:rFonts w:ascii="Consolas" w:hAnsi="Consolas"/>
-                <w:sz w:val="17"/>
-              </w:rPr>
-              <w:t xml:space="preserve">    --cors-configuration 'AllowOrigins=*,AllowMethods=GET,POST,OPTIONS,AllowHeaders=content-type' \</w:t>
-            </w:r>
-          </w:p>
-          <w:p>
-            <w:r>
-              <w:rPr>
-                <w:rFonts w:ascii="Consolas" w:hAnsi="Consolas"/>
-                <w:sz w:val="17"/>
-              </w:rPr>
-              <w:t xml:space="preserve">    --query ApiId --output text)</w:t>
-            </w:r>
-          </w:p>
-          <w:p>
-            <w:r>
-              <w:rPr>
-                <w:rFonts w:ascii="Consolas" w:hAnsi="Consolas"/>
-                <w:sz w:val="17"/>
-              </w:rPr>
-              <w:t xml:space="preserve">  INT=$(aws apigatewayv2 create-integration --api-id $API_ID --integration-type AWS_PROXY \</w:t>
-            </w:r>
-          </w:p>
-          <w:p>
-            <w:r>
-              <w:rPr>
-                <w:rFonts w:ascii="Consolas" w:hAnsi="Consolas"/>
-                <w:sz w:val="17"/>
-              </w:rPr>
-              <w:t xml:space="preserve">    --integration-uri "$FN_ARN" --payload-format-version 2.0 --timeout-in-millis 29000 \</w:t>
-            </w:r>
-          </w:p>
-          <w:p>
-            <w:r>
-              <w:rPr>
-                <w:rFonts w:ascii="Consolas" w:hAnsi="Consolas"/>
-                <w:sz w:val="17"/>
-              </w:rPr>
-              <w:t xml:space="preserve">    --query IntegrationId --output text)</w:t>
-            </w:r>
-          </w:p>
-          <w:p>
-            <w:r>
-              <w:rPr>
-                <w:rFonts w:ascii="Consolas" w:hAnsi="Consolas"/>
-                <w:sz w:val="17"/>
-              </w:rPr>
-              <w:t xml:space="preserve">  for r in "POST /upload-url" "POST /process" "GET /history"; do</w:t>
-            </w:r>
-          </w:p>
-          <w:p>
-            <w:r>
-              <w:rPr>
-                <w:rFonts w:ascii="Consolas" w:hAnsi="Consolas"/>
-                <w:sz w:val="17"/>
-              </w:rPr>
-              <w:t xml:space="preserve">    aws apigatewayv2 create-route --api-id $API_ID --route-key "$r" --target "integrations/$INT" &gt;/dev/null</w:t>
-            </w:r>
-          </w:p>
-          <w:p>
-            <w:r>
-              <w:rPr>
-                <w:rFonts w:ascii="Consolas" w:hAnsi="Consolas"/>
-                <w:sz w:val="17"/>
-              </w:rPr>
-              <w:t xml:space="preserve">  done</w:t>
-            </w:r>
-          </w:p>
-          <w:p>
-            <w:r>
-              <w:rPr>
-                <w:rFonts w:ascii="Consolas" w:hAnsi="Consolas"/>
-                <w:sz w:val="17"/>
-              </w:rPr>
-              <w:t xml:space="preserve">  aws apigatewayv2 create-stage --api-id $API_ID --stage-name '$default' --auto-deploy \</w:t>
-            </w:r>
-          </w:p>
-          <w:p>
-            <w:r>
-              <w:rPr>
-                <w:rFonts w:ascii="Consolas" w:hAnsi="Consolas"/>
-                <w:sz w:val="17"/>
-              </w:rPr>
-              <w:t xml:space="preserve">    --default-route-settings ThrottlingBurstLimit=20,ThrottlingRateLimit=10 &gt;/dev/null</w:t>
-            </w:r>
-          </w:p>
-          <w:p>
-            <w:r>
-              <w:rPr>
-                <w:rFonts w:ascii="Consolas" w:hAnsi="Consolas"/>
-                <w:sz w:val="17"/>
-              </w:rPr>
-              <w:t xml:space="preserve">  aws lambda add-permission --function-name $FN --statement-id apigw-invoke \</w:t>
-            </w:r>
-          </w:p>
-          <w:p>
-            <w:r>
-              <w:rPr>
-                <w:rFonts w:ascii="Consolas" w:hAnsi="Consolas"/>
-                <w:sz w:val="17"/>
-              </w:rPr>
-              <w:t xml:space="preserve">    --action lambda:InvokeFunction --principal apigateway.amazonaws.com \</w:t>
-            </w:r>
-          </w:p>
-          <w:p>
-            <w:r>
-              <w:rPr>
-                <w:rFonts w:ascii="Consolas" w:hAnsi="Consolas"/>
-                <w:sz w:val="17"/>
-              </w:rPr>
-              <w:t xml:space="preserve">    --source-arn "arn:aws:execute-api:$AWS_REGION:$ACCOUNT:$API_ID/*" &gt;/dev/null</w:t>
-            </w:r>
-          </w:p>
-          <w:p>
-            <w:r>
-              <w:rPr>
-                <w:rFonts w:ascii="Consolas" w:hAnsi="Consolas"/>
-                <w:sz w:val="17"/>
-              </w:rPr>
-              <w:t>fi</w:t>
+              <w:t>swagger: "2.0"</w:t>
+            </w:r>
+          </w:p>
+          <w:p>
+            <w:r>
+              <w:rPr>
+                <w:rFonts w:ascii="Consolas" w:hAnsi="Consolas"/>
+                <w:sz w:val="17"/>
+              </w:rPr>
+              <w:t>info:</w:t>
+            </w:r>
+          </w:p>
+          <w:p>
+            <w:r>
+              <w:rPr>
+                <w:rFonts w:ascii="Consolas" w:hAnsi="Consolas"/>
+                <w:sz w:val="17"/>
+              </w:rPr>
+              <w:t xml:space="preserve">  title: vaanisetu-api</w:t>
+            </w:r>
+          </w:p>
+          <w:p>
+            <w:r>
+              <w:rPr>
+                <w:rFonts w:ascii="Consolas" w:hAnsi="Consolas"/>
+                <w:sz w:val="17"/>
+              </w:rPr>
+              <w:t xml:space="preserve">  description: VaaniSetu AI document reader API</w:t>
+            </w:r>
+          </w:p>
+          <w:p>
+            <w:r>
+              <w:rPr>
+                <w:rFonts w:ascii="Consolas" w:hAnsi="Consolas"/>
+                <w:sz w:val="17"/>
+              </w:rPr>
+              <w:t xml:space="preserve">  version: "1.0.0"</w:t>
+            </w:r>
+          </w:p>
+          <w:p>
+            <w:r>
+              <w:rPr>
+                <w:rFonts w:ascii="Consolas" w:hAnsi="Consolas"/>
+                <w:sz w:val="17"/>
+              </w:rPr>
+              <w:t>schemes:</w:t>
+            </w:r>
+          </w:p>
+          <w:p>
+            <w:r>
+              <w:rPr>
+                <w:rFonts w:ascii="Consolas" w:hAnsi="Consolas"/>
+                <w:sz w:val="17"/>
+              </w:rPr>
+              <w:t xml:space="preserve">  - https</w:t>
+            </w:r>
+          </w:p>
+          <w:p>
+            <w:r>
+              <w:rPr>
+                <w:rFonts w:ascii="Consolas" w:hAnsi="Consolas"/>
+                <w:sz w:val="17"/>
+              </w:rPr>
+              <w:t>produces:</w:t>
+            </w:r>
+          </w:p>
+          <w:p>
+            <w:r>
+              <w:rPr>
+                <w:rFonts w:ascii="Consolas" w:hAnsi="Consolas"/>
+                <w:sz w:val="17"/>
+              </w:rPr>
+              <w:t xml:space="preserve">  - application/json</w:t>
+            </w:r>
+          </w:p>
+          <w:p>
+            <w:r>
+              <w:rPr>
+                <w:rFonts w:ascii="Consolas" w:hAnsi="Consolas"/>
+                <w:sz w:val="17"/>
+              </w:rPr>
+              <w:t>x-google-backend:</w:t>
+            </w:r>
+          </w:p>
+          <w:p>
+            <w:r>
+              <w:rPr>
+                <w:rFonts w:ascii="Consolas" w:hAnsi="Consolas"/>
+                <w:sz w:val="17"/>
+              </w:rPr>
+              <w:t xml:space="preserve">  address: __FUNCTION_URL__</w:t>
+            </w:r>
+          </w:p>
+          <w:p>
+            <w:r>
+              <w:rPr>
+                <w:rFonts w:ascii="Consolas" w:hAnsi="Consolas"/>
+                <w:sz w:val="17"/>
+              </w:rPr>
+              <w:t xml:space="preserve">  path_translation: APPEND_PATH_TO_ADDRESS</w:t>
+            </w:r>
+          </w:p>
+          <w:p>
+            <w:r>
+              <w:rPr>
+                <w:rFonts w:ascii="Consolas" w:hAnsi="Consolas"/>
+                <w:sz w:val="17"/>
+              </w:rPr>
+              <w:t xml:space="preserve">  deadline: 60.0</w:t>
+            </w:r>
+          </w:p>
+          <w:p>
+            <w:r>
+              <w:rPr>
+                <w:rFonts w:ascii="Consolas" w:hAnsi="Consolas"/>
+                <w:sz w:val="17"/>
+              </w:rPr>
+              <w:t>paths:</w:t>
+            </w:r>
+          </w:p>
+          <w:p>
+            <w:r>
+              <w:rPr>
+                <w:rFonts w:ascii="Consolas" w:hAnsi="Consolas"/>
+                <w:sz w:val="17"/>
+              </w:rPr>
+              <w:t xml:space="preserve">  /upload-url:</w:t>
+            </w:r>
+          </w:p>
+          <w:p>
+            <w:r>
+              <w:rPr>
+                <w:rFonts w:ascii="Consolas" w:hAnsi="Consolas"/>
+                <w:sz w:val="17"/>
+              </w:rPr>
+              <w:t xml:space="preserve">    post:</w:t>
+            </w:r>
+          </w:p>
+          <w:p>
+            <w:r>
+              <w:rPr>
+                <w:rFonts w:ascii="Consolas" w:hAnsi="Consolas"/>
+                <w:sz w:val="17"/>
+              </w:rPr>
+              <w:t xml:space="preserve">      operationId: uploadUrl</w:t>
+            </w:r>
+          </w:p>
+          <w:p>
+            <w:r>
+              <w:rPr>
+                <w:rFonts w:ascii="Consolas" w:hAnsi="Consolas"/>
+                <w:sz w:val="17"/>
+              </w:rPr>
+              <w:t xml:space="preserve">      summary: Get a signed Cloud Storage upload URL</w:t>
+            </w:r>
+          </w:p>
+          <w:p>
+            <w:r>
+              <w:rPr>
+                <w:rFonts w:ascii="Consolas" w:hAnsi="Consolas"/>
+                <w:sz w:val="17"/>
+              </w:rPr>
+              <w:t xml:space="preserve">      responses:</w:t>
+            </w:r>
+          </w:p>
+          <w:p>
+            <w:r>
+              <w:rPr>
+                <w:rFonts w:ascii="Consolas" w:hAnsi="Consolas"/>
+                <w:sz w:val="17"/>
+              </w:rPr>
+              <w:t xml:space="preserve">        "200": { description: Signed URL issued }</w:t>
+            </w:r>
+          </w:p>
+          <w:p>
+            <w:r>
+              <w:rPr>
+                <w:rFonts w:ascii="Consolas" w:hAnsi="Consolas"/>
+                <w:sz w:val="17"/>
+              </w:rPr>
+              <w:t xml:space="preserve">    options:</w:t>
+            </w:r>
+          </w:p>
+          <w:p>
+            <w:r>
+              <w:rPr>
+                <w:rFonts w:ascii="Consolas" w:hAnsi="Consolas"/>
+                <w:sz w:val="17"/>
+              </w:rPr>
+              <w:t xml:space="preserve">      operationId: uploadUrlCors</w:t>
+            </w:r>
+          </w:p>
+          <w:p>
+            <w:r>
+              <w:rPr>
+                <w:rFonts w:ascii="Consolas" w:hAnsi="Consolas"/>
+                <w:sz w:val="17"/>
+              </w:rPr>
+              <w:t xml:space="preserve">      responses:</w:t>
+            </w:r>
+          </w:p>
+          <w:p>
+            <w:r>
+              <w:rPr>
+                <w:rFonts w:ascii="Consolas" w:hAnsi="Consolas"/>
+                <w:sz w:val="17"/>
+              </w:rPr>
+              <w:t xml:space="preserve">        "204": { description: CORS preflight }</w:t>
+            </w:r>
+          </w:p>
+        </w:tc>
+      </w:tr>
+    </w:tbl>
+    <w:p>
+      <w:pPr>
+        <w:spacing w:after="80"/>
+      </w:pPr>
+    </w:p>
+    <w:p>
+      <w:r>
+        <w:br w:type="page"/>
+      </w:r>
+    </w:p>
+    <w:p>
+      <w:pPr>
+        <w:keepNext/>
+        <w:spacing w:before="200" w:after="80" w:line="276" w:lineRule="auto"/>
+      </w:pPr>
+      <w:r>
+        <w:rPr>
+          <w:b/>
+          <w:color w:val="1F3864"/>
+          <w:sz w:val="26"/>
+        </w:rPr>
+        <w:t>4.7  Frontend: upload and processing</w:t>
+      </w:r>
+    </w:p>
+    <w:p>
+      <w:pPr>
+        <w:keepNext/>
+        <w:spacing w:after="40" w:line="276" w:lineRule="auto"/>
+      </w:pPr>
+      <w:r>
+        <w:rPr>
+          <w:b/>
+          <w:sz w:val="22"/>
+        </w:rPr>
+        <w:t>frontend/app.js: direct-to-Cloud-Storage upload and pipeline call</w:t>
+      </w:r>
+    </w:p>
+    <w:tbl>
+      <w:tblPr>
+        <w:tblStyle w:val="TableGrid"/>
+        <w:tblW w:w="0" w:type="auto"/>
+        <w:tblLook w:val="04A0" w:firstRow="1" w:lastRow="0" w:firstColumn="1" w:lastColumn="0" w:noHBand="0" w:noVBand="1"/>
+      </w:tblPr>
+      <w:tblGrid>
+        <w:gridCol w:w="8504"/>
+      </w:tblGrid>
+      <w:tr>
+        <w:tc>
+          <w:tcPr>
+            <w:tcW w:w="8504" w:type="dxa"/>
+            <w:shd w:val="clear" w:color="auto" w:fill="F4F4F4"/>
+          </w:tcPr>
+          <w:p>
+            <w:r>
+              <w:rPr>
+                <w:rFonts w:ascii="Consolas" w:hAnsi="Consolas"/>
+                <w:sz w:val="17"/>
+              </w:rPr>
+              <w:t>$("go").addEventListener("click", async () =&gt; {</w:t>
+            </w:r>
+          </w:p>
+          <w:p>
+            <w:r>
+              <w:rPr>
+                <w:rFonts w:ascii="Consolas" w:hAnsi="Consolas"/>
+                <w:sz w:val="17"/>
+              </w:rPr>
+              <w:t xml:space="preserve">  if (!imageBlob) return;</w:t>
+            </w:r>
+          </w:p>
+          <w:p>
+            <w:r>
+              <w:rPr>
+                <w:rFonts w:ascii="Consolas" w:hAnsi="Consolas"/>
+                <w:sz w:val="17"/>
+              </w:rPr>
+              <w:t xml:space="preserve">  hideError();</w:t>
+            </w:r>
+          </w:p>
+          <w:p>
+            <w:r>
+              <w:rPr>
+                <w:rFonts w:ascii="Consolas" w:hAnsi="Consolas"/>
+                <w:sz w:val="17"/>
+              </w:rPr>
+              <w:t xml:space="preserve">  $("go").disabled = true;</w:t>
+            </w:r>
+          </w:p>
+          <w:p>
+            <w:r>
+              <w:rPr>
+                <w:rFonts w:ascii="Consolas" w:hAnsi="Consolas"/>
+                <w:sz w:val="17"/>
+              </w:rPr>
+              <w:t xml:space="preserve">  $("result").hidden = true;</w:t>
+            </w:r>
+          </w:p>
+          <w:p>
+            <w:r>
+              <w:rPr>
+                <w:rFonts w:ascii="Consolas" w:hAnsi="Consolas"/>
+                <w:sz w:val="17"/>
+              </w:rPr>
+              <w:t xml:space="preserve">  $("empty").hidden = false;</w:t>
+            </w:r>
+          </w:p>
+          <w:p>
+            <w:r>
+              <w:rPr>
+                <w:rFonts w:ascii="Consolas" w:hAnsi="Consolas"/>
+                <w:sz w:val="17"/>
+              </w:rPr>
+              <w:t xml:space="preserve">  $("empty").classList.add("busy");</w:t>
+            </w:r>
+          </w:p>
+          <w:p>
+            <w:r>
+              <w:rPr>
+                <w:rFonts w:ascii="Consolas" w:hAnsi="Consolas"/>
+                <w:sz w:val="17"/>
+              </w:rPr>
+              <w:t xml:space="preserve">  $("empty").querySelector("p").textContent = "Reading your document…";</w:t>
+            </w:r>
+          </w:p>
+          <w:p>
+            <w:r>
+              <w:rPr>
+                <w:rFonts w:ascii="Consolas" w:hAnsi="Consolas"/>
+                <w:sz w:val="17"/>
+              </w:rPr>
+              <w:t xml:space="preserve">  let ticker;</w:t>
+            </w:r>
+          </w:p>
+          <w:p>
+            <w:r>
+              <w:rPr>
+                <w:rFonts w:ascii="Consolas" w:hAnsi="Consolas"/>
+                <w:sz w:val="17"/>
+              </w:rPr>
+              <w:t xml:space="preserve">  try {</w:t>
+            </w:r>
+          </w:p>
+          <w:p>
+            <w:r>
+              <w:rPr>
+                <w:rFonts w:ascii="Consolas" w:hAnsi="Consolas"/>
+                <w:sz w:val="17"/>
+              </w:rPr>
+              <w:t xml:space="preserve">    setStep("upload");</w:t>
+            </w:r>
+          </w:p>
+          <w:p>
+            <w:r>
+              <w:rPr>
+                <w:rFonts w:ascii="Consolas" w:hAnsi="Consolas"/>
+                <w:sz w:val="17"/>
+              </w:rPr>
+              <w:t xml:space="preserve">    const up = await api("/upload-url", { contentType: "image/jpeg" });</w:t>
+            </w:r>
+          </w:p>
+          <w:p>
+            <w:r>
+              <w:rPr>
+                <w:rFonts w:ascii="Consolas" w:hAnsi="Consolas"/>
+                <w:sz w:val="17"/>
+              </w:rPr>
+              <w:t xml:space="preserve">    const put = await fetch(up.uploadUrl, { method: "PUT", headers: { "Content-Type": "image/jpeg" }, body: imageBlob });</w:t>
+            </w:r>
+          </w:p>
+          <w:p>
+            <w:r>
+              <w:rPr>
+                <w:rFonts w:ascii="Consolas" w:hAnsi="Consolas"/>
+                <w:sz w:val="17"/>
+              </w:rPr>
+              <w:t xml:space="preserve">    if (!put.ok) throw new Error("Upload to Cloud Storage failed");</w:t>
+            </w:r>
+          </w:p>
+          <w:p>
+            <w:r>
+              <w:rPr>
+                <w:rFonts w:ascii="Consolas" w:hAnsi="Consolas"/>
+                <w:sz w:val="17"/>
+              </w:rPr>
+              <w:t xml:space="preserve"> </w:t>
+            </w:r>
+          </w:p>
+          <w:p>
+            <w:r>
+              <w:rPr>
+                <w:rFonts w:ascii="Consolas" w:hAnsi="Consolas"/>
+                <w:sz w:val="17"/>
+              </w:rPr>
+              <w:t xml:space="preserve">    // The server runs the remaining stages in one call; animate them while we wait.</w:t>
+            </w:r>
+          </w:p>
+          <w:p>
+            <w:r>
+              <w:rPr>
+                <w:rFonts w:ascii="Consolas" w:hAnsi="Consolas"/>
+                <w:sz w:val="17"/>
+              </w:rPr>
+              <w:t xml:space="preserve">    setStep("vision");</w:t>
+            </w:r>
+          </w:p>
+          <w:p>
+            <w:r>
+              <w:rPr>
+                <w:rFonts w:ascii="Consolas" w:hAnsi="Consolas"/>
+                <w:sz w:val="17"/>
+              </w:rPr>
+              <w:t xml:space="preserve">    ticker = [setTimeout(() =&gt; setStep("gemini"), 1200), setTimeout(() =&gt; setStep("tts"), 9000)];</w:t>
+            </w:r>
+          </w:p>
+          <w:p>
+            <w:r>
+              <w:rPr>
+                <w:rFonts w:ascii="Consolas" w:hAnsi="Consolas"/>
+                <w:sz w:val="17"/>
+              </w:rPr>
+              <w:t xml:space="preserve">    const result = await api("/process", { key: up.key, language: selectedLang });</w:t>
+            </w:r>
+          </w:p>
+          <w:p>
+            <w:r>
+              <w:rPr>
+                <w:rFonts w:ascii="Consolas" w:hAnsi="Consolas"/>
+                <w:sz w:val="17"/>
+              </w:rPr>
+              <w:t xml:space="preserve">    ticker.forEach(clearTimeout);</w:t>
+            </w:r>
+          </w:p>
+          <w:p>
+            <w:r>
+              <w:rPr>
+                <w:rFonts w:ascii="Consolas" w:hAnsi="Consolas"/>
+                <w:sz w:val="17"/>
+              </w:rPr>
+              <w:t xml:space="preserve">    setStep("all");</w:t>
+            </w:r>
+          </w:p>
+          <w:p>
+            <w:r>
+              <w:rPr>
+                <w:rFonts w:ascii="Consolas" w:hAnsi="Consolas"/>
+                <w:sz w:val="17"/>
+              </w:rPr>
+              <w:t xml:space="preserve">    showResult(result, true);</w:t>
+            </w:r>
+          </w:p>
+          <w:p>
+            <w:r>
+              <w:rPr>
+                <w:rFonts w:ascii="Consolas" w:hAnsi="Consolas"/>
+                <w:sz w:val="17"/>
+              </w:rPr>
+              <w:t xml:space="preserve">    loadHistory();</w:t>
+            </w:r>
+          </w:p>
+          <w:p>
+            <w:r>
+              <w:rPr>
+                <w:rFonts w:ascii="Consolas" w:hAnsi="Consolas"/>
+                <w:sz w:val="17"/>
+              </w:rPr>
+              <w:t xml:space="preserve">  } catch (err) {</w:t>
+            </w:r>
+          </w:p>
+          <w:p>
+            <w:r>
+              <w:rPr>
+                <w:rFonts w:ascii="Consolas" w:hAnsi="Consolas"/>
+                <w:sz w:val="17"/>
+              </w:rPr>
+              <w:t xml:space="preserve">    (ticker || []).forEach(clearTimeout);</w:t>
+            </w:r>
+          </w:p>
+          <w:p>
+            <w:r>
+              <w:rPr>
+                <w:rFonts w:ascii="Consolas" w:hAnsi="Consolas"/>
+                <w:sz w:val="17"/>
+              </w:rPr>
+              <w:t xml:space="preserve">    setStep("none");</w:t>
+            </w:r>
+          </w:p>
+          <w:p>
+            <w:r>
+              <w:rPr>
+                <w:rFonts w:ascii="Consolas" w:hAnsi="Consolas"/>
+                <w:sz w:val="17"/>
+              </w:rPr>
+              <w:t xml:space="preserve">    showError(err.message);</w:t>
+            </w:r>
+          </w:p>
+          <w:p>
+            <w:r>
+              <w:rPr>
+                <w:rFonts w:ascii="Consolas" w:hAnsi="Consolas"/>
+                <w:sz w:val="17"/>
+              </w:rPr>
+              <w:t xml:space="preserve">    $("empty").querySelector("p").textContent = "Your explanation will appear and play here.";</w:t>
+            </w:r>
+          </w:p>
+          <w:p>
+            <w:r>
+              <w:rPr>
+                <w:rFonts w:ascii="Consolas" w:hAnsi="Consolas"/>
+                <w:sz w:val="17"/>
+              </w:rPr>
+              <w:t xml:space="preserve">  } finally {</w:t>
+            </w:r>
+          </w:p>
+          <w:p>
+            <w:r>
+              <w:rPr>
+                <w:rFonts w:ascii="Consolas" w:hAnsi="Consolas"/>
+                <w:sz w:val="17"/>
+              </w:rPr>
+              <w:t xml:space="preserve">    $("go").disabled = false;</w:t>
+            </w:r>
+          </w:p>
+          <w:p>
+            <w:r>
+              <w:rPr>
+                <w:rFonts w:ascii="Consolas" w:hAnsi="Consolas"/>
+                <w:sz w:val="17"/>
+              </w:rPr>
+              <w:t xml:space="preserve">    $("empty").classList.remove("busy");</w:t>
+            </w:r>
+          </w:p>
+          <w:p>
+            <w:r>
+              <w:rPr>
+                <w:rFonts w:ascii="Consolas" w:hAnsi="Consolas"/>
+                <w:sz w:val="17"/>
+              </w:rPr>
+              <w:t xml:space="preserve">  }</w:t>
+            </w:r>
+          </w:p>
+          <w:p>
+            <w:r>
+              <w:rPr>
+                <w:rFonts w:ascii="Consolas" w:hAnsi="Consolas"/>
+                <w:sz w:val="17"/>
+              </w:rPr>
+              <w:t>});</w:t>
             </w:r>
           </w:p>
         </w:tc>
@@ -4754,7 +5067,7 @@
           <w:noProof/>
         </w:rPr>
         <w:drawing>
-          <wp:inline distT="0" distB="0" distL="0" distR="0" wp14:anchorId="4A6D56BB" wp14:editId="5FA52809">
+          <wp:inline distT="0" distB="0" distL="0" distR="0" wp14:anchorId="67213299" wp14:editId="7F9EFF0E">
             <wp:extent cx="5400000" cy="2749091"/>
             <wp:effectExtent l="0" t="0" r="0" b="0"/>
             <wp:docPr id="2" name="Picture 2"/>
@@ -4800,7 +5113,7 @@
           <w:i/>
           <w:sz w:val="21"/>
         </w:rPr>
-        <w:t>Figure 5.1: VaaniSetu home page (hosted on AWS Amplify)</w:t>
+        <w:t>Figure 5.1: VaaniSetu home page (hosted on Cloud Storage)</w:t>
       </w:r>
     </w:p>
     <w:p>
@@ -4814,7 +5127,7 @@
           <w:noProof/>
         </w:rPr>
         <w:drawing>
-          <wp:inline distT="0" distB="0" distL="0" distR="0" wp14:anchorId="5DFDD4E2" wp14:editId="6DDCC65A">
+          <wp:inline distT="0" distB="0" distL="0" distR="0" wp14:anchorId="11ABB65F" wp14:editId="03801EC7">
             <wp:extent cx="5400000" cy="2749091"/>
             <wp:effectExtent l="0" t="0" r="0" b="0"/>
             <wp:docPr id="3" name="Picture 3"/>
@@ -4860,7 +5173,7 @@
           <w:i/>
           <w:sz w:val="21"/>
         </w:rPr>
-        <w:t>Figure 5.2: English college notice explained and spoken in Hindi; the pipeline tracker shows every AWS service completed</w:t>
+        <w:t>Figure 5.2: English college notice explained and spoken in Hindi; the pipeline tracker shows every Google Cloud service completed</w:t>
       </w:r>
     </w:p>
     <w:p>
@@ -4879,7 +5192,7 @@
           <w:noProof/>
         </w:rPr>
         <w:drawing>
-          <wp:inline distT="0" distB="0" distL="0" distR="0" wp14:anchorId="49B26C3F" wp14:editId="5CEF88F9">
+          <wp:inline distT="0" distB="0" distL="0" distR="0" wp14:anchorId="6529579C" wp14:editId="7E12F906">
             <wp:extent cx="5400000" cy="2749091"/>
             <wp:effectExtent l="0" t="0" r="0" b="0"/>
             <wp:docPr id="4" name="Picture 4"/>
@@ -4939,7 +5252,7 @@
           <w:noProof/>
         </w:rPr>
         <w:drawing>
-          <wp:inline distT="0" distB="0" distL="0" distR="0" wp14:anchorId="6C669B5C" wp14:editId="37630FA2">
+          <wp:inline distT="0" distB="0" distL="0" distR="0" wp14:anchorId="38E856F6" wp14:editId="445CF7E7">
             <wp:extent cx="5400000" cy="2749091"/>
             <wp:effectExtent l="0" t="0" r="0" b="0"/>
             <wp:docPr id="5" name="Picture 5"/>
@@ -4950,7 +5263,7 @@
               <a:graphicData uri="http://schemas.openxmlformats.org/drawingml/2006/picture">
                 <pic:pic xmlns:pic="http://schemas.openxmlformats.org/drawingml/2006/picture">
                   <pic:nvPicPr>
-                    <pic:cNvPr id="0" name="04-history.jpg"/>
+                    <pic:cNvPr id="0" name="04-result-spanish-prescription.jpg"/>
                     <pic:cNvPicPr/>
                   </pic:nvPicPr>
                   <pic:blipFill>
@@ -4985,7 +5298,7 @@
           <w:i/>
           <w:sz w:val="21"/>
         </w:rPr>
-        <w:t>Figure 5.4: History of processed documents loaded from Amazon DynamoDB</w:t>
+        <w:t>Figure 5.4: Prescription explained in Spanish with the audio playing</w:t>
       </w:r>
     </w:p>
     <w:p>
@@ -5004,8 +5317,8 @@
           <w:noProof/>
         </w:rPr>
         <w:drawing>
-          <wp:inline distT="0" distB="0" distL="0" distR="0" wp14:anchorId="6E5B9363" wp14:editId="4A323F7D">
-            <wp:extent cx="5400000" cy="2932977"/>
+          <wp:inline distT="0" distB="0" distL="0" distR="0" wp14:anchorId="3D9F3F45" wp14:editId="214B188E">
+            <wp:extent cx="5400000" cy="2749091"/>
             <wp:effectExtent l="0" t="0" r="0" b="0"/>
             <wp:docPr id="6" name="Picture 6"/>
             <wp:cNvGraphicFramePr>
@@ -5015,7 +5328,7 @@
               <a:graphicData uri="http://schemas.openxmlformats.org/drawingml/2006/picture">
                 <pic:pic xmlns:pic="http://schemas.openxmlformats.org/drawingml/2006/picture">
                   <pic:nvPicPr>
-                    <pic:cNvPr id="0" name="05-lambda.jpg"/>
+                    <pic:cNvPr id="0" name="05-history.jpg"/>
                     <pic:cNvPicPr/>
                   </pic:nvPicPr>
                   <pic:blipFill>
@@ -5027,7 +5340,7 @@
                   <pic:spPr>
                     <a:xfrm>
                       <a:off x="0" y="0"/>
-                      <a:ext cx="5400000" cy="2932977"/>
+                      <a:ext cx="5400000" cy="2749091"/>
                     </a:xfrm>
                     <a:prstGeom prst="rect">
                       <a:avLst/>
@@ -5050,7 +5363,7 @@
           <w:i/>
           <w:sz w:val="21"/>
         </w:rPr>
-        <w:t>Figure 5.5: AWS Lambda function vaanisetu-api with its API Gateway trigger</w:t>
+        <w:t>Figure 5.5: History of processed documents loaded from Firestore</w:t>
       </w:r>
     </w:p>
     <w:p>
@@ -5064,8 +5377,8 @@
           <w:noProof/>
         </w:rPr>
         <w:drawing>
-          <wp:inline distT="0" distB="0" distL="0" distR="0" wp14:anchorId="04BA8870" wp14:editId="0310E4FE">
-            <wp:extent cx="5400000" cy="2745525"/>
+          <wp:inline distT="0" distB="0" distL="0" distR="0" wp14:anchorId="58F9B4EF" wp14:editId="7E9F1B3F">
+            <wp:extent cx="5400000" cy="2749091"/>
             <wp:effectExtent l="0" t="0" r="0" b="0"/>
             <wp:docPr id="7" name="Picture 7"/>
             <wp:cNvGraphicFramePr>
@@ -5075,7 +5388,7 @@
               <a:graphicData uri="http://schemas.openxmlformats.org/drawingml/2006/picture">
                 <pic:pic xmlns:pic="http://schemas.openxmlformats.org/drawingml/2006/picture">
                   <pic:nvPicPr>
-                    <pic:cNvPr id="0" name="06-api-gateway.jpg"/>
+                    <pic:cNvPr id="0" name="06-cloud-run-function.jpg"/>
                     <pic:cNvPicPr/>
                   </pic:nvPicPr>
                   <pic:blipFill>
@@ -5087,7 +5400,7 @@
                   <pic:spPr>
                     <a:xfrm>
                       <a:off x="0" y="0"/>
-                      <a:ext cx="5400000" cy="2745525"/>
+                      <a:ext cx="5400000" cy="2749091"/>
                     </a:xfrm>
                     <a:prstGeom prst="rect">
                       <a:avLst/>
@@ -5110,7 +5423,7 @@
           <w:i/>
           <w:sz w:val="21"/>
         </w:rPr>
-        <w:t>Figure 5.6: Amazon API Gateway HTTP API routes</w:t>
+        <w:t>Figure 5.6: Cloud Run function vaanisetu-api with request metrics</w:t>
       </w:r>
     </w:p>
     <w:p>
@@ -5129,7 +5442,7 @@
           <w:noProof/>
         </w:rPr>
         <w:drawing>
-          <wp:inline distT="0" distB="0" distL="0" distR="0" wp14:anchorId="3A2D8F82" wp14:editId="00E740A7">
+          <wp:inline distT="0" distB="0" distL="0" distR="0" wp14:anchorId="38E54BB4" wp14:editId="4F961022">
             <wp:extent cx="5400000" cy="2749091"/>
             <wp:effectExtent l="0" t="0" r="0" b="0"/>
             <wp:docPr id="8" name="Picture 8"/>
@@ -5140,7 +5453,7 @@
               <a:graphicData uri="http://schemas.openxmlformats.org/drawingml/2006/picture">
                 <pic:pic xmlns:pic="http://schemas.openxmlformats.org/drawingml/2006/picture">
                   <pic:nvPicPr>
-                    <pic:cNvPr id="0" name="07-s3-audio.jpg"/>
+                    <pic:cNvPr id="0" name="07-api-gateway.jpg"/>
                     <pic:cNvPicPr/>
                   </pic:nvPicPr>
                   <pic:blipFill>
@@ -5175,7 +5488,7 @@
           <w:i/>
           <w:sz w:val="21"/>
         </w:rPr>
-        <w:t>Figure 5.7: Amazon S3 bucket with MP3 files generated by Amazon Polly</w:t>
+        <w:t>Figure 5.7: API Gateway vaanisetu-gateway (active, asia-northeast1)</w:t>
       </w:r>
     </w:p>
     <w:p>
@@ -5189,8 +5502,8 @@
           <w:noProof/>
         </w:rPr>
         <w:drawing>
-          <wp:inline distT="0" distB="0" distL="0" distR="0" wp14:anchorId="42A809A7" wp14:editId="43873458">
-            <wp:extent cx="5400000" cy="2745525"/>
+          <wp:inline distT="0" distB="0" distL="0" distR="0" wp14:anchorId="4AF5B6BA" wp14:editId="4F6FD742">
+            <wp:extent cx="5400000" cy="2749091"/>
             <wp:effectExtent l="0" t="0" r="0" b="0"/>
             <wp:docPr id="9" name="Picture 9"/>
             <wp:cNvGraphicFramePr>
@@ -5200,7 +5513,7 @@
               <a:graphicData uri="http://schemas.openxmlformats.org/drawingml/2006/picture">
                 <pic:pic xmlns:pic="http://schemas.openxmlformats.org/drawingml/2006/picture">
                   <pic:nvPicPr>
-                    <pic:cNvPr id="0" name="08-dynamodb.jpg"/>
+                    <pic:cNvPr id="0" name="08-cloud-storage-audio.jpg"/>
                     <pic:cNvPicPr/>
                   </pic:nvPicPr>
                   <pic:blipFill>
@@ -5212,7 +5525,7 @@
                   <pic:spPr>
                     <a:xfrm>
                       <a:off x="0" y="0"/>
-                      <a:ext cx="5400000" cy="2745525"/>
+                      <a:ext cx="5400000" cy="2749091"/>
                     </a:xfrm>
                     <a:prstGeom prst="rect">
                       <a:avLst/>
@@ -5235,7 +5548,7 @@
           <w:i/>
           <w:sz w:val="21"/>
         </w:rPr>
-        <w:t>Figure 5.8: Amazon DynamoDB table vaanisetu-documents with stored results</w:t>
+        <w:t>Figure 5.8: Cloud Storage bucket with MP3 files generated by Cloud Text-to-Speech</w:t>
       </w:r>
     </w:p>
     <w:p>
@@ -5254,7 +5567,7 @@
           <w:noProof/>
         </w:rPr>
         <w:drawing>
-          <wp:inline distT="0" distB="0" distL="0" distR="0" wp14:anchorId="34EFEFC2" wp14:editId="73CDAC81">
+          <wp:inline distT="0" distB="0" distL="0" distR="0" wp14:anchorId="10A1E914" wp14:editId="2E775F89">
             <wp:extent cx="5400000" cy="2749091"/>
             <wp:effectExtent l="0" t="0" r="0" b="0"/>
             <wp:docPr id="10" name="Picture 10"/>
@@ -5265,7 +5578,7 @@
               <a:graphicData uri="http://schemas.openxmlformats.org/drawingml/2006/picture">
                 <pic:pic xmlns:pic="http://schemas.openxmlformats.org/drawingml/2006/picture">
                   <pic:nvPicPr>
-                    <pic:cNvPr id="0" name="09-amplify.jpg"/>
+                    <pic:cNvPr id="0" name="09-firestore.jpg"/>
                     <pic:cNvPicPr/>
                   </pic:nvPicPr>
                   <pic:blipFill>
@@ -5300,7 +5613,7 @@
           <w:i/>
           <w:sz w:val="21"/>
         </w:rPr>
-        <w:t>Figure 5.9: AWS Amplify Hosting app with the deployed main branch</w:t>
+        <w:t>Figure 5.9: Firestore document with the stored result</w:t>
       </w:r>
     </w:p>
     <w:p>
@@ -5314,8 +5627,8 @@
           <w:noProof/>
         </w:rPr>
         <w:drawing>
-          <wp:inline distT="0" distB="0" distL="0" distR="0" wp14:anchorId="345FD88F" wp14:editId="5C03BDFD">
-            <wp:extent cx="5400000" cy="2745525"/>
+          <wp:inline distT="0" distB="0" distL="0" distR="0" wp14:anchorId="3498D83F" wp14:editId="66ACBBAE">
+            <wp:extent cx="5400000" cy="2749091"/>
             <wp:effectExtent l="0" t="0" r="0" b="0"/>
             <wp:docPr id="11" name="Picture 11"/>
             <wp:cNvGraphicFramePr>
@@ -5325,7 +5638,7 @@
               <a:graphicData uri="http://schemas.openxmlformats.org/drawingml/2006/picture">
                 <pic:pic xmlns:pic="http://schemas.openxmlformats.org/drawingml/2006/picture">
                   <pic:nvPicPr>
-                    <pic:cNvPr id="0" name="10-cloudwatch.jpg"/>
+                    <pic:cNvPr id="0" name="10-iam-service-accounts.jpg"/>
                     <pic:cNvPicPr/>
                   </pic:nvPicPr>
                   <pic:blipFill>
@@ -5337,7 +5650,7 @@
                   <pic:spPr>
                     <a:xfrm>
                       <a:off x="0" y="0"/>
-                      <a:ext cx="5400000" cy="2745525"/>
+                      <a:ext cx="5400000" cy="2749091"/>
                     </a:xfrm>
                     <a:prstGeom prst="rect">
                       <a:avLst/>
@@ -5360,7 +5673,132 @@
           <w:i/>
           <w:sz w:val="21"/>
         </w:rPr>
-        <w:t>Figure 5.10: Amazon CloudWatch log group for the Lambda function</w:t>
+        <w:t>Figure 5.10: Least-privilege IAM service accounts</w:t>
+      </w:r>
+    </w:p>
+    <w:p>
+      <w:r>
+        <w:br w:type="page"/>
+      </w:r>
+    </w:p>
+    <w:p>
+      <w:pPr>
+        <w:keepNext/>
+        <w:spacing w:after="40"/>
+        <w:jc w:val="center"/>
+      </w:pPr>
+      <w:r>
+        <w:rPr>
+          <w:noProof/>
+        </w:rPr>
+        <w:drawing>
+          <wp:inline distT="0" distB="0" distL="0" distR="0" wp14:anchorId="0BA8F767" wp14:editId="6C27E130">
+            <wp:extent cx="5400000" cy="2749091"/>
+            <wp:effectExtent l="0" t="0" r="0" b="0"/>
+            <wp:docPr id="12" name="Picture 12"/>
+            <wp:cNvGraphicFramePr>
+              <a:graphicFrameLocks xmlns:a="http://schemas.openxmlformats.org/drawingml/2006/main" noChangeAspect="1"/>
+            </wp:cNvGraphicFramePr>
+            <a:graphic xmlns:a="http://schemas.openxmlformats.org/drawingml/2006/main">
+              <a:graphicData uri="http://schemas.openxmlformats.org/drawingml/2006/picture">
+                <pic:pic xmlns:pic="http://schemas.openxmlformats.org/drawingml/2006/picture">
+                  <pic:nvPicPr>
+                    <pic:cNvPr id="0" name="11-cloud-logging.jpg"/>
+                    <pic:cNvPicPr/>
+                  </pic:nvPicPr>
+                  <pic:blipFill>
+                    <a:blip r:embed="rId19"/>
+                    <a:stretch>
+                      <a:fillRect/>
+                    </a:stretch>
+                  </pic:blipFill>
+                  <pic:spPr>
+                    <a:xfrm>
+                      <a:off x="0" y="0"/>
+                      <a:ext cx="5400000" cy="2749091"/>
+                    </a:xfrm>
+                    <a:prstGeom prst="rect">
+                      <a:avLst/>
+                    </a:prstGeom>
+                  </pic:spPr>
+                </pic:pic>
+              </a:graphicData>
+            </a:graphic>
+          </wp:inline>
+        </w:drawing>
+      </w:r>
+    </w:p>
+    <w:p>
+      <w:pPr>
+        <w:spacing w:after="240" w:line="276" w:lineRule="auto"/>
+        <w:jc w:val="center"/>
+      </w:pPr>
+      <w:r>
+        <w:rPr>
+          <w:i/>
+          <w:sz w:val="21"/>
+        </w:rPr>
+        <w:t>Figure 5.11: Cloud Logging showing every API request with latency</w:t>
+      </w:r>
+    </w:p>
+    <w:p>
+      <w:pPr>
+        <w:keepNext/>
+        <w:spacing w:after="40"/>
+        <w:jc w:val="center"/>
+      </w:pPr>
+      <w:r>
+        <w:rPr>
+          <w:noProof/>
+        </w:rPr>
+        <w:drawing>
+          <wp:inline distT="0" distB="0" distL="0" distR="0" wp14:anchorId="50F6E62C" wp14:editId="2AE90A04">
+            <wp:extent cx="5400000" cy="2749091"/>
+            <wp:effectExtent l="0" t="0" r="0" b="0"/>
+            <wp:docPr id="13" name="Picture 13"/>
+            <wp:cNvGraphicFramePr>
+              <a:graphicFrameLocks xmlns:a="http://schemas.openxmlformats.org/drawingml/2006/main" noChangeAspect="1"/>
+            </wp:cNvGraphicFramePr>
+            <a:graphic xmlns:a="http://schemas.openxmlformats.org/drawingml/2006/main">
+              <a:graphicData uri="http://schemas.openxmlformats.org/drawingml/2006/picture">
+                <pic:pic xmlns:pic="http://schemas.openxmlformats.org/drawingml/2006/picture">
+                  <pic:nvPicPr>
+                    <pic:cNvPr id="0" name="12-budget-alert.jpg"/>
+                    <pic:cNvPicPr/>
+                  </pic:nvPicPr>
+                  <pic:blipFill>
+                    <a:blip r:embed="rId20"/>
+                    <a:stretch>
+                      <a:fillRect/>
+                    </a:stretch>
+                  </pic:blipFill>
+                  <pic:spPr>
+                    <a:xfrm>
+                      <a:off x="0" y="0"/>
+                      <a:ext cx="5400000" cy="2749091"/>
+                    </a:xfrm>
+                    <a:prstGeom prst="rect">
+                      <a:avLst/>
+                    </a:prstGeom>
+                  </pic:spPr>
+                </pic:pic>
+              </a:graphicData>
+            </a:graphic>
+          </wp:inline>
+        </w:drawing>
+      </w:r>
+    </w:p>
+    <w:p>
+      <w:pPr>
+        <w:spacing w:after="240" w:line="276" w:lineRule="auto"/>
+        <w:jc w:val="center"/>
+      </w:pPr>
+      <w:r>
+        <w:rPr>
+          <w:i/>
+          <w:sz w:val="21"/>
+        </w:rPr>
+        <w:t>Figure 5.12: Budget alert of 400 INR (no credits used)</w:t>
       </w:r>
     </w:p>
     <w:p>
@@ -5391,7 +5829,7 @@
         <w:jc w:val="both"/>
       </w:pPr>
       <w:r>
-        <w:t>VaaniSetu shows how managed cloud services can be combined into a useful, socially relevant product with very little infrastructure code. A photo taken on a phone becomes a clear spoken explanation in the user's own language in about ten seconds. In testing, Amazon Rekognition took about 1 second, Amazon Bedrock (Nova 2 Lite) about 4 seconds and Amazon Polly about 1.5 to 2 seconds per document.</w:t>
+        <w:t>VaaniSetu shows how managed cloud services can be combined into a useful, socially relevant product with very little infrastructure code. A photo taken on a phone becomes a clear spoken explanation in the user's own language in about eleven seconds. In testing, Cloud Vision took about 1.5 seconds, Gemini 3.5 Flash-Lite about 3.5 seconds and Cloud Text-to-Speech about 2 seconds per document.</w:t>
       </w:r>
     </w:p>
     <w:p>
@@ -5415,7 +5853,7 @@
         <w:jc w:val="both"/>
       </w:pPr>
       <w:r>
-        <w:t>•  A fully serverless application on AWS integrating eight core services plus IAM and CloudWatch.</w:t>
+        <w:t>•  A fully serverless application on Google Cloud integrating eight core services plus IAM and Cloud Logging.</w:t>
       </w:r>
     </w:p>
     <w:p>
@@ -5435,7 +5873,7 @@
         <w:jc w:val="both"/>
       </w:pPr>
       <w:r>
-        <w:t>•  Security by design: private S3 buckets, short-lived pre-signed URLs, encryption at rest and a least-privilege IAM role.</w:t>
+        <w:t>•  Security by design: private buckets, short-lived signed URLs, encryption at rest and least-privilege service accounts.</w:t>
       </w:r>
     </w:p>
     <w:p>
@@ -5445,7 +5883,7 @@
         <w:jc w:val="both"/>
       </w:pPr>
       <w:r>
-        <w:t>•  Pay-per-use cost: there are no running servers, so the application costs nothing when idle.</w:t>
+        <w:t>•  Zero idle cost: the function scales to zero and there are no servers, so the application costs nothing when nobody is using it. A budget alert guards against surprises.</w:t>
       </w:r>
     </w:p>
     <w:p>
@@ -5479,7 +5917,7 @@
         <w:jc w:val="both"/>
       </w:pPr>
       <w:r>
-        <w:t>•  The AWS Free-plan account did not allow Amazon Textract, Translate or Comprehend. The design was changed to use a multimodal model on Amazon Bedrock, which reads, translates and summarises in a single call.</w:t>
+        <w:t>•  The project was first built on AWS, but the AWS account was suspended. Because the infrastructure was scripted, the whole system was rebuilt on Google Cloud service for service; the AWS version remains in the Git history.</w:t>
       </w:r>
     </w:p>
     <w:p>
@@ -5489,7 +5927,7 @@
         <w:jc w:val="both"/>
       </w:pPr>
       <w:r>
-        <w:t>•  Amazon CloudFront required account verification for new accounts, so the frontend was hosted on AWS Amplify Hosting, which also provides HTTPS and a CDN.</w:t>
+        <w:t>•  Gemini 3.8 Flash took 16 to 24 seconds per document. Benchmarking six Gemini models on the real prompt showed that Gemini 3.5 Flash-Lite with thinking turned off answers in about 3.5 seconds with correct output, and it is also the cheapest.</w:t>
       </w:r>
     </w:p>
     <w:p>
@@ -5499,7 +5937,7 @@
         <w:jc w:val="both"/>
       </w:pPr>
       <w:r>
-        <w:t>•  Rekognition's text detection supports Latin script only. It is therefore used as a fast, low-cost "is there text?" gate, while Bedrock performs the multilingual reading.</w:t>
+        <w:t>•  API Gateway is not offered in Mumbai, so the gateway runs in Tokyo and routes to the function in Mumbai.</w:t>
       </w:r>
     </w:p>
     <w:p>
@@ -5509,7 +5947,7 @@
         <w:jc w:val="both"/>
       </w:pPr>
       <w:r>
-        <w:t>•  API Gateway limits requests to 29 seconds, so uploads go directly to S3 and the AI pipeline was designed to finish in about 10 seconds.</w:t>
+        <w:t>•  Cloud Run functions have no private key for signing URLs, so the function signs Cloud Storage URLs through the IAM signBlob API using its own service account.</w:t>
       </w:r>
     </w:p>
     <w:p>
@@ -5533,7 +5971,7 @@
         <w:jc w:val="both"/>
       </w:pPr>
       <w:r>
-        <w:t>•  Support multi-page PDFs using asynchronous processing with Amazon SQS or AWS Step Functions.</w:t>
+        <w:t>•  Support multi-page PDFs using asynchronous processing with Pub/Sub and Workflows.</w:t>
       </w:r>
     </w:p>
     <w:p>
@@ -5543,7 +5981,7 @@
         <w:jc w:val="both"/>
       </w:pPr>
       <w:r>
-        <w:t>•  Add more Indian languages as Amazon Polly voices become available, and a voice question-and-answer mode ("When is my next dose?").</w:t>
+        <w:t>•  Add more Indian languages (Marathi, Tamil, Bengali and others, which Cloud Text-to-Speech already supports) and a voice question-and-answer mode ("When is my next dose?").</w:t>
       </w:r>
     </w:p>
     <w:p>
@@ -5553,7 +5991,7 @@
         <w:jc w:val="both"/>
       </w:pPr>
       <w:r>
-        <w:t>•  User accounts with Amazon Cognito so that each user's history is private.</w:t>
+        <w:t>•  User accounts with Firebase Authentication so that each user's history is private.</w:t>
       </w:r>
     </w:p>
     <w:p>
@@ -5574,7 +6012,7 @@
         <w:rPr>
           <w:sz w:val="22"/>
         </w:rPr>
-        <w:t>Live application: https://main.dubqxztshiysh.amplifyapp.com</w:t>
+        <w:t>Live application: https://storage.googleapis.com/vaanisetu-web-project-2acd026b-3237-497d-89d/index.html</w:t>
       </w:r>
     </w:p>
     <w:p>
@@ -5589,8 +6027,8 @@
       </w:r>
     </w:p>
     <w:sectPr>
-      <w:headerReference w:type="default" r:id="rId19"/>
-      <w:footerReference w:type="default" r:id="rId20"/>
+      <w:headerReference w:type="default" r:id="rId21"/>
+      <w:footerReference w:type="default" r:id="rId22"/>
       <w:pgSz w:w="11347" w:h="18144"/>
       <w:pgMar w:top="1247" w:right="1411" w:bottom="1134" w:left="1411" w:header="720" w:footer="720" w:gutter="0"/>
       <w:pgNumType w:start="1"/>

</xml_diff>